<commit_message>
Changed cubes and plates color, updated report
</commit_message>
<xml_diff>
--- a/Doc/Rapport_PRE-TPI.docx
+++ b/Doc/Rapport_PRE-TPI.docx
@@ -183,7 +183,11 @@
     <w:sdt>
       <w:sdtPr>
         <w:rPr>
-          <w:lang w:val="fr-FR"/>
+          <w:rFonts w:asciiTheme="minorHAnsi" w:eastAsiaTheme="minorHAnsi" w:hAnsiTheme="minorHAnsi" w:cstheme="minorBidi"/>
+          <w:color w:val="auto"/>
+          <w:sz w:val="22"/>
+          <w:szCs w:val="22"/>
+          <w:lang w:val="fr-FR" w:eastAsia="en-US"/>
         </w:rPr>
         <w:id w:val="-2076811007"/>
         <w:docPartObj>
@@ -193,13 +197,8 @@
       </w:sdtPr>
       <w:sdtEndPr>
         <w:rPr>
-          <w:rFonts w:asciiTheme="minorHAnsi" w:eastAsiaTheme="minorHAnsi" w:hAnsiTheme="minorHAnsi" w:cstheme="minorBidi"/>
           <w:b/>
           <w:bCs/>
-          <w:color w:val="auto"/>
-          <w:sz w:val="22"/>
-          <w:szCs w:val="22"/>
-          <w:lang w:eastAsia="en-US"/>
         </w:rPr>
       </w:sdtEndPr>
       <w:sdtContent>
@@ -735,23 +734,7 @@
                 <w:noProof/>
                 <w:sz w:val="28"/>
               </w:rPr>
-              <w:t>An</w:t>
-            </w:r>
-            <w:r>
-              <w:rPr>
-                <w:rStyle w:val="Lienhypertexte"/>
-                <w:noProof/>
-                <w:sz w:val="28"/>
-              </w:rPr>
-              <w:t>n</w:t>
-            </w:r>
-            <w:r>
-              <w:rPr>
-                <w:rStyle w:val="Lienhypertexte"/>
-                <w:noProof/>
-                <w:sz w:val="28"/>
-              </w:rPr>
-              <w:t>exes</w:t>
+              <w:t>Annexes</w:t>
             </w:r>
             <w:r>
               <w:rPr>
@@ -854,17 +837,121 @@
     </w:p>
     <w:p>
       <w:r>
-        <w:t>Présentation du contexte du travail pratique</w:t>
-      </w:r>
-    </w:p>
-    <w:p>
-      <w:r>
-        <w:t>Objectifs du TP (ce que l'on cherche à démontrer ou à apprendre)</w:t>
-      </w:r>
-    </w:p>
-    <w:p>
-      <w:r>
-        <w:t>Éventuelles hypothèses de départ</w:t>
+        <w:t xml:space="preserve">Dans le cadre du </w:t>
+      </w:r>
+      <w:r>
+        <w:t>PRE-</w:t>
+      </w:r>
+      <w:r>
+        <w:t xml:space="preserve">TPI, il a fallu réaliser un projet informatique sous 80 périodes. Ce projet était supervisé par M. Schenk qui, lorsque cela s'est avéré nécessaire, a été consulté pour </w:t>
+      </w:r>
+      <w:r>
+        <w:t xml:space="preserve">recevoir </w:t>
+      </w:r>
+      <w:r>
+        <w:t>de</w:t>
+      </w:r>
+      <w:r>
+        <w:t>s</w:t>
+      </w:r>
+      <w:r>
+        <w:t xml:space="preserve"> conseils.</w:t>
+      </w:r>
+      <w:r>
+        <w:t xml:space="preserve"> Le but du PRE-TPI est de préparer l’élève pour le TPI final. Le PRE-TPI a les même objectifs qu’un vrai TPI, il faut donc rendre le rapport, le cahier des charges et le travail réalisé. Une fois tout ces éléments rendus il faut, normalement, présenter le projet devant deux experts et le superviseur. Dans notre cas le seul qui posera des questions et examinera le projet sera M. Schenk.</w:t>
+      </w:r>
+    </w:p>
+    <w:p>
+      <w:pPr>
+        <w:rPr>
+          <w:u w:val="single"/>
+        </w:rPr>
+      </w:pPr>
+      <w:r>
+        <w:rPr>
+          <w:u w:val="single"/>
+        </w:rPr>
+        <w:t>Description</w:t>
+      </w:r>
+      <w:r>
+        <w:rPr>
+          <w:u w:val="single"/>
+        </w:rPr>
+        <w:t xml:space="preserve"> du projet :</w:t>
+      </w:r>
+    </w:p>
+    <w:p>
+      <w:r>
+        <w:t>« </w:t>
+      </w:r>
+      <w:r>
+        <w:t>Le but est de développer un jeu, avec la librairie de Raylib, qui permet à un joueur de résoudre des puzzles dans un environnement tridimensionnel et bidimensionnel. Pour passer d’une dimension à une autre et résoudre les puzzles avec des éléments cachés, on change le point de vue de la caméra.</w:t>
+      </w:r>
+      <w:r>
+        <w:t xml:space="preserve"> </w:t>
+      </w:r>
+      <w:r>
+        <w:t>Les éléments présents dans l’environnement pour que le joueur résout le puzzle sont par exemple :</w:t>
+      </w:r>
+      <w:r>
+        <w:br/>
+        <w:t>des plaques de pressions, des cubes déplaçables, des clés, des boutons, etc…</w:t>
+      </w:r>
+      <w:r>
+        <w:t> »</w:t>
+      </w:r>
+    </w:p>
+    <w:p>
+      <w:pPr>
+        <w:rPr>
+          <w:u w:val="single"/>
+        </w:rPr>
+      </w:pPr>
+      <w:r>
+        <w:rPr>
+          <w:u w:val="single"/>
+        </w:rPr>
+        <w:t>Hypothèses :</w:t>
+      </w:r>
+    </w:p>
+    <w:p>
+      <w:r>
+        <w:t>Dans le cahier des charges il est mentionné que</w:t>
+      </w:r>
+      <w:r>
+        <w:t>,</w:t>
+      </w:r>
+      <w:r>
+        <w:t xml:space="preserve"> si l’avancement du projet était optimal il aurait été possible de pousser le projet plus loin en ajoutant des fonctionnalités</w:t>
+      </w:r>
+      <w:r>
+        <w:t>, textures, niveaux, etc</w:t>
+      </w:r>
+      <w:r>
+        <w:t>.</w:t>
+      </w:r>
+      <w:r>
+        <w:t>..</w:t>
+      </w:r>
+    </w:p>
+    <w:p>
+      <w:r>
+        <w:t>L’idée de départ est de réaliser un MVP (Pro</w:t>
+      </w:r>
+      <w:r>
+        <w:t>duit</w:t>
+      </w:r>
+      <w:r>
+        <w:t xml:space="preserve"> minimum viable) afin de présenter ce à quoi pourrait ressembler </w:t>
+      </w:r>
+      <w:r>
+        <w:rPr>
+          <w:b/>
+        </w:rPr>
+        <w:t>un</w:t>
+      </w:r>
+      <w:r>
+        <w:t xml:space="preserve"> niveau du jeu.</w:t>
       </w:r>
     </w:p>
     <w:p>
@@ -882,23 +969,118 @@
       <w:bookmarkEnd w:id="1"/>
     </w:p>
     <w:p>
-      <w:r>
-        <w:t>Liste du matériel utilisé (</w:t>
-      </w:r>
-      <w:r>
-        <w:t>ex :</w:t>
-      </w:r>
-      <w:r>
-        <w:t xml:space="preserve"> logiciels, outils, composants...)</w:t>
-      </w:r>
-    </w:p>
-    <w:p>
-      <w:r>
+      <w:pPr>
+        <w:rPr>
+          <w:u w:val="single"/>
+        </w:rPr>
+      </w:pPr>
+      <w:r>
+        <w:rPr>
+          <w:u w:val="single"/>
+        </w:rPr>
+        <w:t>Matériel utilisé :</w:t>
+      </w:r>
+    </w:p>
+    <w:p>
+      <w:r>
+        <w:t>-</w:t>
+      </w:r>
+      <w:r>
+        <w:t>Ordinateur</w:t>
+      </w:r>
+      <w:r>
+        <w:t xml:space="preserve"> sous Windows</w:t>
+      </w:r>
+      <w:r>
+        <w:t xml:space="preserve"> </w:t>
+      </w:r>
+      <w:r>
+        <w:t>10</w:t>
+      </w:r>
+      <w:r>
+        <w:t xml:space="preserve"> (</w:t>
+      </w:r>
+      <w:r>
+        <w:t>Clavier</w:t>
+      </w:r>
+      <w:r>
+        <w:t xml:space="preserve">, </w:t>
+      </w:r>
+      <w:r>
+        <w:t>souris</w:t>
+      </w:r>
+      <w:r>
+        <w:t xml:space="preserve">, </w:t>
+      </w:r>
+      <w:r>
+        <w:t>écran</w:t>
+      </w:r>
+      <w:r>
+        <w:t xml:space="preserve">, </w:t>
+      </w:r>
+      <w:r>
+        <w:t>etc</w:t>
+      </w:r>
+      <w:r>
+        <w:t>…)</w:t>
+      </w:r>
+    </w:p>
+    <w:p>
+      <w:r>
+        <w:t>-Visual Studio 2022, avec la librairie Raylib</w:t>
+      </w:r>
+      <w:r>
+        <w:t xml:space="preserve"> (Écriture du code)</w:t>
+      </w:r>
+    </w:p>
+    <w:p>
+      <w:r>
+        <w:t>-GitHub</w:t>
+      </w:r>
+      <w:r>
+        <w:t xml:space="preserve"> (Déposer le code et nommer les étapes avec les commit)</w:t>
+      </w:r>
+    </w:p>
+    <w:p>
+      <w:r>
+        <w:t>-Krita (Logiciel de dessin, montage, retouche)</w:t>
+      </w:r>
+    </w:p>
+    <w:p>
+      <w:pPr>
+        <w:rPr>
+          <w:color w:val="FF0000"/>
+        </w:rPr>
+      </w:pPr>
+      <w:r>
+        <w:rPr>
+          <w:color w:val="FF0000"/>
+        </w:rPr>
         <w:t>Description de la méthode suivie (étapes du TP, protocoles, schémas...)</w:t>
       </w:r>
     </w:p>
     <w:p>
       <w:r>
+        <w:t xml:space="preserve">Chaque jour de travail il a été demandé de remplir un journal de travail afin d’avoir un suivi sur l’avancement du projet ainsi que les problèmes rencontrés. La rédaction de ce journal est soutenue par le code modifié dans les commit réalisés sur GitHub qui ont été préalablement nommé. Également, il fallu alimenter un planning et le mettre à jour au fur et à mesure. </w:t>
+      </w:r>
+    </w:p>
+    <w:p>
+      <w:r>
+        <w:t>Dans les dernières semaines du PRE-TPI, la rédaction du rapport et d’une présentation a été engagée pour finaliser le projet.</w:t>
+      </w:r>
+      <w:bookmarkStart w:id="2" w:name="_GoBack"/>
+      <w:bookmarkEnd w:id="2"/>
+    </w:p>
+    <w:p>
+      <w:pPr>
+        <w:rPr>
+          <w:color w:val="FF0000"/>
+        </w:rPr>
+      </w:pPr>
+      <w:r>
+        <w:rPr>
+          <w:color w:val="FF0000"/>
+        </w:rPr>
         <w:t>Justification des choix méthodologiques</w:t>
       </w:r>
     </w:p>
@@ -910,24 +1092,48 @@
           <w:numId w:val="1"/>
         </w:numPr>
       </w:pPr>
-      <w:bookmarkStart w:id="2" w:name="_Toc190676905"/>
+      <w:bookmarkStart w:id="3" w:name="_Toc190676905"/>
       <w:r>
         <w:t>Réalisation et observations</w:t>
       </w:r>
-      <w:bookmarkEnd w:id="2"/>
-    </w:p>
-    <w:p>
-      <w:r>
+      <w:bookmarkEnd w:id="3"/>
+    </w:p>
+    <w:p>
+      <w:pPr>
+        <w:rPr>
+          <w:color w:val="FF0000"/>
+        </w:rPr>
+      </w:pPr>
+      <w:r>
+        <w:rPr>
+          <w:color w:val="FF0000"/>
+        </w:rPr>
         <w:t>Déroulement du TP étape par étape</w:t>
       </w:r>
     </w:p>
     <w:p>
-      <w:r>
+      <w:pPr>
+        <w:rPr>
+          <w:color w:val="FF0000"/>
+        </w:rPr>
+      </w:pPr>
+      <w:r>
+        <w:rPr>
+          <w:color w:val="FF0000"/>
+        </w:rPr>
         <w:t>Difficultés rencontrées et solutions apportées</w:t>
       </w:r>
     </w:p>
     <w:p>
-      <w:r>
+      <w:pPr>
+        <w:rPr>
+          <w:color w:val="FF0000"/>
+        </w:rPr>
+      </w:pPr>
+      <w:r>
+        <w:rPr>
+          <w:color w:val="FF0000"/>
+        </w:rPr>
         <w:t>Observations et comportements relevés pendant l’expérience</w:t>
       </w:r>
     </w:p>
@@ -939,24 +1145,49 @@
           <w:numId w:val="1"/>
         </w:numPr>
       </w:pPr>
-      <w:bookmarkStart w:id="3" w:name="_Toc190676906"/>
-      <w:r>
+      <w:bookmarkStart w:id="4" w:name="_Toc190676906"/>
+      <w:r>
+        <w:lastRenderedPageBreak/>
         <w:t>Résultats</w:t>
       </w:r>
-      <w:bookmarkEnd w:id="3"/>
-    </w:p>
-    <w:p>
-      <w:r>
+      <w:bookmarkEnd w:id="4"/>
+    </w:p>
+    <w:p>
+      <w:pPr>
+        <w:rPr>
+          <w:color w:val="FF0000"/>
+        </w:rPr>
+      </w:pPr>
+      <w:r>
+        <w:rPr>
+          <w:color w:val="FF0000"/>
+        </w:rPr>
         <w:t>Présentation des résultats obtenus (tableaux, graphiques, images, mesures…)</w:t>
       </w:r>
     </w:p>
     <w:p>
-      <w:r>
+      <w:pPr>
+        <w:rPr>
+          <w:color w:val="FF0000"/>
+        </w:rPr>
+      </w:pPr>
+      <w:r>
+        <w:rPr>
+          <w:color w:val="FF0000"/>
+        </w:rPr>
         <w:t>Comparaison avec les attentes ou théories (si applicable)</w:t>
       </w:r>
     </w:p>
     <w:p>
-      <w:r>
+      <w:pPr>
+        <w:rPr>
+          <w:color w:val="FF0000"/>
+        </w:rPr>
+      </w:pPr>
+      <w:r>
+        <w:rPr>
+          <w:color w:val="FF0000"/>
+        </w:rPr>
         <w:t>Vérification de la cohérence des résultats</w:t>
       </w:r>
     </w:p>
@@ -968,24 +1199,48 @@
           <w:numId w:val="1"/>
         </w:numPr>
       </w:pPr>
-      <w:bookmarkStart w:id="4" w:name="_Toc190676907"/>
+      <w:bookmarkStart w:id="5" w:name="_Toc190676907"/>
       <w:r>
         <w:t>Conclusion</w:t>
       </w:r>
-      <w:bookmarkEnd w:id="4"/>
-    </w:p>
-    <w:p>
-      <w:r>
+      <w:bookmarkEnd w:id="5"/>
+    </w:p>
+    <w:p>
+      <w:pPr>
+        <w:rPr>
+          <w:color w:val="FF0000"/>
+        </w:rPr>
+      </w:pPr>
+      <w:r>
+        <w:rPr>
+          <w:color w:val="FF0000"/>
+        </w:rPr>
         <w:t>Récapitulatif des points clés</w:t>
       </w:r>
     </w:p>
     <w:p>
-      <w:r>
+      <w:pPr>
+        <w:rPr>
+          <w:color w:val="FF0000"/>
+        </w:rPr>
+      </w:pPr>
+      <w:r>
+        <w:rPr>
+          <w:color w:val="FF0000"/>
+        </w:rPr>
         <w:t>Validation ou non des objectifs et hypothèses</w:t>
       </w:r>
     </w:p>
     <w:p>
-      <w:r>
+      <w:pPr>
+        <w:rPr>
+          <w:color w:val="FF0000"/>
+        </w:rPr>
+      </w:pPr>
+      <w:r>
+        <w:rPr>
+          <w:color w:val="FF0000"/>
+        </w:rPr>
         <w:t>Apprentissage et perspectives pour une amélioration future</w:t>
       </w:r>
     </w:p>
@@ -997,26 +1252,48 @@
           <w:numId w:val="1"/>
         </w:numPr>
       </w:pPr>
-      <w:bookmarkStart w:id="5" w:name="_Toc190676908"/>
-      <w:bookmarkStart w:id="6" w:name="_GoBack"/>
+      <w:bookmarkStart w:id="6" w:name="_Toc190676908"/>
+      <w:r>
+        <w:t>Annexes</w:t>
+      </w:r>
       <w:bookmarkEnd w:id="6"/>
-      <w:r>
-        <w:t>Annexes</w:t>
-      </w:r>
-      <w:bookmarkEnd w:id="5"/>
-    </w:p>
-    <w:p>
-      <w:r>
+    </w:p>
+    <w:p>
+      <w:pPr>
+        <w:rPr>
+          <w:color w:val="FF0000"/>
+        </w:rPr>
+      </w:pPr>
+      <w:r>
+        <w:rPr>
+          <w:color w:val="FF0000"/>
+        </w:rPr>
         <w:t>Codes sources</w:t>
       </w:r>
     </w:p>
     <w:p>
-      <w:r>
+      <w:pPr>
+        <w:rPr>
+          <w:color w:val="FF0000"/>
+        </w:rPr>
+      </w:pPr>
+      <w:r>
+        <w:rPr>
+          <w:color w:val="FF0000"/>
+        </w:rPr>
         <w:t>Documents complémentaires</w:t>
       </w:r>
     </w:p>
     <w:p>
-      <w:r>
+      <w:pPr>
+        <w:rPr>
+          <w:color w:val="FF0000"/>
+        </w:rPr>
+      </w:pPr>
+      <w:r>
+        <w:rPr>
+          <w:color w:val="FF0000"/>
+        </w:rPr>
         <w:t>Références utilisées</w:t>
       </w:r>
     </w:p>
@@ -2010,7 +2287,7 @@
 </file>
 
 <file path=customXml/itemProps1.xml><?xml version="1.0" encoding="utf-8"?>
-<ds:datastoreItem xmlns:ds="http://schemas.openxmlformats.org/officeDocument/2006/customXml" ds:itemID="{CF016C2C-77D8-4B61-B978-62191F539F16}">
+<ds:datastoreItem xmlns:ds="http://schemas.openxmlformats.org/officeDocument/2006/customXml" ds:itemID="{16474489-A555-4572-97FA-4986AE47FAFF}">
   <ds:schemaRefs>
     <ds:schemaRef ds:uri="http://schemas.openxmlformats.org/officeDocument/2006/bibliography"/>
   </ds:schemaRefs>

</xml_diff>

<commit_message>
Updated report, fixed issue with topview and pressure plate
</commit_message>
<xml_diff>
--- a/Doc/Rapport_PRE-TPI.docx
+++ b/Doc/Rapport_PRE-TPI.docx
@@ -4,6 +4,10 @@
   <w:body>
     <w:p>
       <w:pPr>
+        <w:tabs>
+          <w:tab w:val="left" w:pos="750"/>
+          <w:tab w:val="center" w:pos="4536"/>
+        </w:tabs>
         <w:spacing w:before="1560" w:after="720"/>
         <w:jc w:val="center"/>
         <w:rPr>
@@ -98,14 +102,9 @@
           <w:sz w:val="36"/>
         </w:rPr>
         <w:sectPr>
+          <w:headerReference w:type="default" r:id="rId8"/>
           <w:pgSz w:w="11906" w:h="16838"/>
           <w:pgMar w:top="1417" w:right="1417" w:bottom="1417" w:left="1417" w:header="708" w:footer="708" w:gutter="0"/>
-          <w:pgBorders w:offsetFrom="page">
-            <w:top w:val="thinThickLargeGap" w:sz="24" w:space="24" w:color="auto"/>
-            <w:left w:val="thinThickLargeGap" w:sz="24" w:space="24" w:color="auto"/>
-            <w:bottom w:val="thickThinLargeGap" w:sz="24" w:space="24" w:color="auto"/>
-            <w:right w:val="thickThinLargeGap" w:sz="24" w:space="24" w:color="auto"/>
-          </w:pgBorders>
           <w:cols w:space="708"/>
           <w:docGrid w:linePitch="360"/>
         </w:sectPr>
@@ -140,7 +139,7 @@
                     <pic:cNvPicPr/>
                   </pic:nvPicPr>
                   <pic:blipFill>
-                    <a:blip r:embed="rId6" cstate="print">
+                    <a:blip r:embed="rId9" cstate="print">
                       <a:extLst>
                         <a:ext uri="{28A0092B-C50C-407E-A947-70E740481C1C}">
                           <a14:useLocalDpi xmlns:a14="http://schemas.microsoft.com/office/drawing/2010/main" val="0"/>
@@ -595,7 +594,7 @@
                 <w:webHidden/>
                 <w:sz w:val="28"/>
               </w:rPr>
-              <w:t>3</w:t>
+              <w:t>4</w:t>
             </w:r>
             <w:r>
               <w:rPr>
@@ -688,7 +687,7 @@
                 <w:webHidden/>
                 <w:sz w:val="28"/>
               </w:rPr>
-              <w:t>3</w:t>
+              <w:t>4</w:t>
             </w:r>
             <w:r>
               <w:rPr>
@@ -781,7 +780,7 @@
                 <w:webHidden/>
                 <w:sz w:val="28"/>
               </w:rPr>
-              <w:t>3</w:t>
+              <w:t>4</w:t>
             </w:r>
             <w:r>
               <w:rPr>
@@ -798,12 +797,6 @@
             <w:sectPr>
               <w:pgSz w:w="11906" w:h="16838"/>
               <w:pgMar w:top="1417" w:right="1417" w:bottom="1417" w:left="1417" w:header="708" w:footer="708" w:gutter="0"/>
-              <w:pgBorders w:offsetFrom="page">
-                <w:top w:val="thinThickLargeGap" w:sz="24" w:space="24" w:color="auto"/>
-                <w:left w:val="thinThickLargeGap" w:sz="24" w:space="24" w:color="auto"/>
-                <w:bottom w:val="thickThinLargeGap" w:sz="24" w:space="24" w:color="auto"/>
-                <w:right w:val="thickThinLargeGap" w:sz="24" w:space="24" w:color="auto"/>
-              </w:pgBorders>
               <w:cols w:space="708"/>
               <w:docGrid w:linePitch="360"/>
             </w:sectPr>
@@ -864,26 +857,25 @@
     <w:p>
       <w:pPr>
         <w:rPr>
-          <w:u w:val="single"/>
-        </w:rPr>
-      </w:pPr>
-      <w:r>
-        <w:rPr>
-          <w:u w:val="single"/>
+          <w:b/>
+        </w:rPr>
+      </w:pPr>
+      <w:r>
+        <w:rPr>
+          <w:b/>
         </w:rPr>
         <w:t>Description</w:t>
       </w:r>
       <w:r>
         <w:rPr>
-          <w:u w:val="single"/>
-        </w:rPr>
-        <w:t xml:space="preserve"> du projet :</w:t>
-      </w:r>
-    </w:p>
-    <w:p>
-      <w:r>
-        <w:t>« </w:t>
-      </w:r>
+          <w:b/>
+        </w:rPr>
+        <w:t xml:space="preserve"> du projet</w:t>
+      </w:r>
+      <w:bookmarkStart w:id="1" w:name="_GoBack"/>
+      <w:bookmarkEnd w:id="1"/>
+    </w:p>
+    <w:p>
       <w:r>
         <w:t>Le but est de développer un jeu, avec la librairie de Raylib, qui permet à un joueur de résoudre des puzzles dans un environnement tridimensionnel et bidimensionnel. Pour passer d’une dimension à une autre et résoudre les puzzles avec des éléments cachés, on change le point de vue de la caméra.</w:t>
       </w:r>
@@ -898,20 +890,20 @@
         <w:t>des plaques de pressions, des cubes déplaçables, des clés, des boutons, etc…</w:t>
       </w:r>
       <w:r>
-        <w:t> »</w:t>
-      </w:r>
-    </w:p>
-    <w:p>
-      <w:pPr>
-        <w:rPr>
-          <w:u w:val="single"/>
-        </w:rPr>
-      </w:pPr>
-      <w:r>
-        <w:rPr>
-          <w:u w:val="single"/>
-        </w:rPr>
-        <w:t>Hypothèses :</w:t>
+        <w:t> </w:t>
+      </w:r>
+    </w:p>
+    <w:p>
+      <w:pPr>
+        <w:rPr>
+          <w:b/>
+        </w:rPr>
+      </w:pPr>
+      <w:r>
+        <w:rPr>
+          <w:b/>
+        </w:rPr>
+        <w:t>Hypothèses</w:t>
       </w:r>
     </w:p>
     <w:p>
@@ -936,22 +928,43 @@
     </w:p>
     <w:p>
       <w:r>
-        <w:t>L’idée de départ est de réaliser un MVP (Pro</w:t>
-      </w:r>
-      <w:r>
-        <w:t>duit</w:t>
-      </w:r>
-      <w:r>
-        <w:t xml:space="preserve"> minimum viable) afin de présenter ce à quoi pourrait ressembler </w:t>
+        <w:t xml:space="preserve">L’idée de départ est de réaliser un </w:t>
       </w:r>
       <w:r>
         <w:rPr>
           <w:b/>
         </w:rPr>
-        <w:t>un</w:t>
-      </w:r>
-      <w:r>
-        <w:t xml:space="preserve"> niveau du jeu.</w:t>
+        <w:t>MVP</w:t>
+      </w:r>
+      <w:r>
+        <w:rPr>
+          <w:b/>
+        </w:rPr>
+        <w:t xml:space="preserve"> </w:t>
+      </w:r>
+      <w:r>
+        <w:t xml:space="preserve">(Produit minimum viable) </w:t>
+      </w:r>
+      <w:r>
+        <w:rPr>
+          <w:b/>
+        </w:rPr>
+        <w:t>ou prototype</w:t>
+      </w:r>
+      <w:r>
+        <w:t xml:space="preserve"> afin de présenter ce à quoi pourrait ressembler </w:t>
+      </w:r>
+      <w:r>
+        <w:t>le</w:t>
+      </w:r>
+      <w:r>
+        <w:rPr>
+          <w:b/>
+        </w:rPr>
+        <w:t xml:space="preserve"> </w:t>
+      </w:r>
+      <w:r>
+        <w:t>jeu.</w:t>
       </w:r>
     </w:p>
     <w:p>
@@ -962,29 +975,45 @@
           <w:numId w:val="1"/>
         </w:numPr>
       </w:pPr>
-      <w:bookmarkStart w:id="1" w:name="_Toc190676904"/>
+      <w:bookmarkStart w:id="2" w:name="_Toc190676904"/>
       <w:r>
         <w:t>Matériel et méthodes</w:t>
       </w:r>
-      <w:bookmarkEnd w:id="1"/>
-    </w:p>
-    <w:p>
-      <w:pPr>
-        <w:rPr>
-          <w:u w:val="single"/>
-        </w:rPr>
-      </w:pPr>
-      <w:r>
-        <w:rPr>
-          <w:u w:val="single"/>
-        </w:rPr>
-        <w:t>Matériel utilisé :</w:t>
-      </w:r>
-    </w:p>
-    <w:p>
-      <w:r>
-        <w:t>-</w:t>
-      </w:r>
+      <w:bookmarkEnd w:id="2"/>
+    </w:p>
+    <w:p>
+      <w:pPr>
+        <w:rPr>
+          <w:b/>
+        </w:rPr>
+      </w:pPr>
+      <w:r>
+        <w:rPr>
+          <w:b/>
+        </w:rPr>
+        <w:t>Matériel</w:t>
+      </w:r>
+      <w:r>
+        <w:rPr>
+          <w:b/>
+        </w:rPr>
+        <w:t>/logiciels</w:t>
+      </w:r>
+      <w:r>
+        <w:rPr>
+          <w:b/>
+        </w:rPr>
+        <w:t xml:space="preserve"> utilisé</w:t>
+      </w:r>
+    </w:p>
+    <w:p>
+      <w:pPr>
+        <w:pStyle w:val="Paragraphedeliste"/>
+        <w:numPr>
+          <w:ilvl w:val="0"/>
+          <w:numId w:val="2"/>
+        </w:numPr>
+      </w:pPr>
       <w:r>
         <w:t>Ordinateur</w:t>
       </w:r>
@@ -1026,24 +1055,198 @@
       </w:r>
     </w:p>
     <w:p>
-      <w:r>
-        <w:t>-Visual Studio 2022, avec la librairie Raylib</w:t>
+      <w:pPr>
+        <w:pStyle w:val="Paragraphedeliste"/>
+        <w:numPr>
+          <w:ilvl w:val="0"/>
+          <w:numId w:val="2"/>
+        </w:numPr>
+      </w:pPr>
+      <w:hyperlink r:id="rId10" w:history="1">
+        <w:r>
+          <w:rPr>
+            <w:rStyle w:val="Lienhypertexte"/>
+          </w:rPr>
+          <w:t>Visual Studio 2022</w:t>
+        </w:r>
+      </w:hyperlink>
+      <w:r>
+        <w:t xml:space="preserve">, avec la librairie </w:t>
+      </w:r>
+      <w:r>
+        <w:fldChar w:fldCharType="begin"/>
+      </w:r>
+      <w:r>
+        <w:instrText>HYPERLINK "https://www.raylib.com"</w:instrText>
+      </w:r>
+      <w:r>
+        <w:fldChar w:fldCharType="separate"/>
+      </w:r>
+      <w:r>
+        <w:rPr>
+          <w:rStyle w:val="Lienhypertexte"/>
+        </w:rPr>
+        <w:t>Rayl</w:t>
+      </w:r>
+      <w:r>
+        <w:rPr>
+          <w:rStyle w:val="Lienhypertexte"/>
+        </w:rPr>
+        <w:t>i</w:t>
+      </w:r>
+      <w:r>
+        <w:rPr>
+          <w:rStyle w:val="Lienhypertexte"/>
+        </w:rPr>
+        <w:t>b</w:t>
+      </w:r>
+      <w:r>
+        <w:fldChar w:fldCharType="end"/>
       </w:r>
       <w:r>
         <w:t xml:space="preserve"> (Écriture du code)</w:t>
       </w:r>
     </w:p>
     <w:p>
-      <w:r>
-        <w:t>-GitHub</w:t>
-      </w:r>
+      <w:pPr>
+        <w:pStyle w:val="Paragraphedeliste"/>
+        <w:numPr>
+          <w:ilvl w:val="0"/>
+          <w:numId w:val="2"/>
+        </w:numPr>
+      </w:pPr>
+      <w:hyperlink r:id="rId11" w:history="1">
+        <w:r>
+          <w:rPr>
+            <w:rStyle w:val="Lienhypertexte"/>
+          </w:rPr>
+          <w:t>GitHub</w:t>
+        </w:r>
+      </w:hyperlink>
       <w:r>
         <w:t xml:space="preserve"> (Déposer le code et nommer les étapes avec les commit)</w:t>
       </w:r>
     </w:p>
     <w:p>
-      <w:r>
-        <w:t>-Krita (Logiciel de dessin, montage, retouche)</w:t>
+      <w:pPr>
+        <w:pStyle w:val="Paragraphedeliste"/>
+        <w:numPr>
+          <w:ilvl w:val="0"/>
+          <w:numId w:val="2"/>
+        </w:numPr>
+      </w:pPr>
+      <w:hyperlink r:id="rId12" w:history="1">
+        <w:r>
+          <w:rPr>
+            <w:rStyle w:val="Lienhypertexte"/>
+          </w:rPr>
+          <w:t>Krita</w:t>
+        </w:r>
+      </w:hyperlink>
+      <w:r>
+        <w:t xml:space="preserve"> (Logiciel de dessin, montage, retouche)</w:t>
+      </w:r>
+    </w:p>
+    <w:p>
+      <w:pPr>
+        <w:rPr>
+          <w:b/>
+        </w:rPr>
+      </w:pPr>
+      <w:r>
+        <w:rPr>
+          <w:b/>
+        </w:rPr>
+        <w:t>Sources utiles</w:t>
+      </w:r>
+    </w:p>
+    <w:p>
+      <w:pPr>
+        <w:pStyle w:val="Paragraphedeliste"/>
+        <w:numPr>
+          <w:ilvl w:val="0"/>
+          <w:numId w:val="3"/>
+        </w:numPr>
+      </w:pPr>
+      <w:hyperlink r:id="rId13" w:history="1">
+        <w:r>
+          <w:rPr>
+            <w:rStyle w:val="Lienhypertexte"/>
+          </w:rPr>
+          <w:t>Freesound</w:t>
+        </w:r>
+      </w:hyperlink>
+      <w:r>
+        <w:t xml:space="preserve"> (Effets sonores</w:t>
+      </w:r>
+      <w:r>
+        <w:t xml:space="preserve"> et </w:t>
+      </w:r>
+      <w:r>
+        <w:t>musiques gratui</w:t>
+      </w:r>
+      <w:r>
+        <w:t>ts)</w:t>
+      </w:r>
+    </w:p>
+    <w:p>
+      <w:pPr>
+        <w:pStyle w:val="Paragraphedeliste"/>
+        <w:numPr>
+          <w:ilvl w:val="0"/>
+          <w:numId w:val="3"/>
+        </w:numPr>
+      </w:pPr>
+      <w:hyperlink r:id="rId14" w:history="1">
+        <w:r>
+          <w:rPr>
+            <w:rStyle w:val="Lienhypertexte"/>
+          </w:rPr>
+          <w:t>Sketchfab</w:t>
+        </w:r>
+      </w:hyperlink>
+      <w:r>
+        <w:t xml:space="preserve"> (Modèles 3D gratuits)</w:t>
+      </w:r>
+    </w:p>
+    <w:p>
+      <w:pPr>
+        <w:pStyle w:val="Paragraphedeliste"/>
+        <w:numPr>
+          <w:ilvl w:val="0"/>
+          <w:numId w:val="3"/>
+        </w:numPr>
+      </w:pPr>
+      <w:hyperlink r:id="rId15" w:history="1">
+        <w:r>
+          <w:rPr>
+            <w:rStyle w:val="Lienhypertexte"/>
+          </w:rPr>
+          <w:t>Raylib (cheatsheet)</w:t>
+        </w:r>
+      </w:hyperlink>
+      <w:r>
+        <w:t xml:space="preserve"> (Utilisation de la librairie)</w:t>
+      </w:r>
+    </w:p>
+    <w:p>
+      <w:pPr>
+        <w:pStyle w:val="Paragraphedeliste"/>
+        <w:numPr>
+          <w:ilvl w:val="0"/>
+          <w:numId w:val="3"/>
+        </w:numPr>
+      </w:pPr>
+      <w:hyperlink r:id="rId16" w:history="1">
+        <w:r>
+          <w:rPr>
+            <w:rStyle w:val="Lienhypertexte"/>
+          </w:rPr>
+          <w:t>ChatGPT</w:t>
+        </w:r>
+      </w:hyperlink>
+      <w:r>
+        <w:t xml:space="preserve"> (Debug, idées, corrections)</w:t>
       </w:r>
     </w:p>
     <w:p>
@@ -1061,15 +1264,25 @@
     </w:p>
     <w:p>
       <w:r>
-        <w:t xml:space="preserve">Chaque jour de travail il a été demandé de remplir un journal de travail afin d’avoir un suivi sur l’avancement du projet ainsi que les problèmes rencontrés. La rédaction de ce journal est soutenue par le code modifié dans les commit réalisés sur GitHub qui ont été préalablement nommé. Également, il fallu alimenter un planning et le mettre à jour au fur et à mesure. </w:t>
+        <w:t>Chaque jour de travail il a été demandé de remplir un journal de travail afin d’avoir un suivi sur l’avancement du projet ainsi que les problèmes rencontrés. La rédaction de ce journal est soutenue par le code modifié dans les commit réalisés sur GitHub qui ont été préalablement nommé</w:t>
+      </w:r>
+      <w:r>
+        <w:t>s</w:t>
+      </w:r>
+      <w:r>
+        <w:t xml:space="preserve">. Également, il fallu alimenter un planning et le mettre </w:t>
+      </w:r>
+      <w:r>
+        <w:t>à jour quotidiennement</w:t>
+      </w:r>
+      <w:r>
+        <w:t xml:space="preserve">. </w:t>
       </w:r>
     </w:p>
     <w:p>
       <w:r>
         <w:t>Dans les dernières semaines du PRE-TPI, la rédaction du rapport et d’une présentation a été engagée pour finaliser le projet.</w:t>
       </w:r>
-      <w:bookmarkStart w:id="2" w:name="_GoBack"/>
-      <w:bookmarkEnd w:id="2"/>
     </w:p>
     <w:p>
       <w:pPr>
@@ -1094,6 +1307,7 @@
       </w:pPr>
       <w:bookmarkStart w:id="3" w:name="_Toc190676905"/>
       <w:r>
+        <w:lastRenderedPageBreak/>
         <w:t>Réalisation et observations</w:t>
       </w:r>
       <w:bookmarkEnd w:id="3"/>
@@ -1147,7 +1361,6 @@
       </w:pPr>
       <w:bookmarkStart w:id="4" w:name="_Toc190676906"/>
       <w:r>
-        <w:lastRenderedPageBreak/>
         <w:t>Résultats</w:t>
       </w:r>
       <w:bookmarkEnd w:id="4"/>
@@ -1298,19 +1511,275 @@
       </w:r>
     </w:p>
     <w:sectPr>
+      <w:headerReference w:type="default" r:id="rId17"/>
+      <w:footerReference w:type="default" r:id="rId18"/>
       <w:pgSz w:w="11906" w:h="16838"/>
       <w:pgMar w:top="1417" w:right="1417" w:bottom="1417" w:left="1417" w:header="708" w:footer="708" w:gutter="0"/>
-      <w:pgBorders w:offsetFrom="page">
-        <w:top w:val="thinThickLargeGap" w:sz="24" w:space="24" w:color="auto"/>
-        <w:left w:val="thinThickLargeGap" w:sz="24" w:space="24" w:color="auto"/>
-        <w:bottom w:val="thickThinLargeGap" w:sz="24" w:space="24" w:color="auto"/>
-        <w:right w:val="thickThinLargeGap" w:sz="24" w:space="24" w:color="auto"/>
-      </w:pgBorders>
       <w:cols w:space="708"/>
       <w:docGrid w:linePitch="360"/>
     </w:sectPr>
   </w:body>
 </w:document>
+</file>
+
+<file path=word/endnotes.xml><?xml version="1.0" encoding="utf-8"?>
+<w:endnotes xmlns:wpc="http://schemas.microsoft.com/office/word/2010/wordprocessingCanvas" xmlns:cx="http://schemas.microsoft.com/office/drawing/2014/chartex" xmlns:cx1="http://schemas.microsoft.com/office/drawing/2015/9/8/chartex" xmlns:cx2="http://schemas.microsoft.com/office/drawing/2015/10/21/chartex" xmlns:cx3="http://schemas.microsoft.com/office/drawing/2016/5/9/chartex" xmlns:cx4="http://schemas.microsoft.com/office/drawing/2016/5/10/chartex" xmlns:cx5="http://schemas.microsoft.com/office/drawing/2016/5/11/chartex" xmlns:cx6="http://schemas.microsoft.com/office/drawing/2016/5/12/chartex" xmlns:cx7="http://schemas.microsoft.com/office/drawing/2016/5/13/chartex" xmlns:cx8="http://schemas.microsoft.com/office/drawing/2016/5/14/chartex" xmlns:mc="http://schemas.openxmlformats.org/markup-compatibility/2006" xmlns:aink="http://schemas.microsoft.com/office/drawing/2016/ink" xmlns:am3d="http://schemas.microsoft.com/office/drawing/2017/model3d" xmlns:o="urn:schemas-microsoft-com:office:office" xmlns:r="http://schemas.openxmlformats.org/officeDocument/2006/relationships" xmlns:m="http://schemas.openxmlformats.org/officeDocument/2006/math" xmlns:v="urn:schemas-microsoft-com:vml" xmlns:wp14="http://schemas.microsoft.com/office/word/2010/wordprocessingDrawing" xmlns:wp="http://schemas.openxmlformats.org/drawingml/2006/wordprocessingDrawing" xmlns:w10="urn:schemas-microsoft-com:office:word" xmlns:w="http://schemas.openxmlformats.org/wordprocessingml/2006/main" xmlns:w14="http://schemas.microsoft.com/office/word/2010/wordml" xmlns:w15="http://schemas.microsoft.com/office/word/2012/wordml" xmlns:w16cid="http://schemas.microsoft.com/office/word/2016/wordml/cid" xmlns:w16se="http://schemas.microsoft.com/office/word/2015/wordml/symex" xmlns:wpg="http://schemas.microsoft.com/office/word/2010/wordprocessingGroup" xmlns:wpi="http://schemas.microsoft.com/office/word/2010/wordprocessingInk" xmlns:wne="http://schemas.microsoft.com/office/word/2006/wordml" xmlns:wps="http://schemas.microsoft.com/office/word/2010/wordprocessingShape" mc:Ignorable="w14 w15 w16se w16cid wp14">
+  <w:endnote w:type="separator" w:id="-1">
+    <w:p>
+      <w:pPr>
+        <w:spacing w:after="0" w:line="240" w:lineRule="auto"/>
+      </w:pPr>
+      <w:r>
+        <w:separator/>
+      </w:r>
+    </w:p>
+  </w:endnote>
+  <w:endnote w:type="continuationSeparator" w:id="0">
+    <w:p>
+      <w:pPr>
+        <w:spacing w:after="0" w:line="240" w:lineRule="auto"/>
+      </w:pPr>
+      <w:r>
+        <w:continuationSeparator/>
+      </w:r>
+    </w:p>
+  </w:endnote>
+</w:endnotes>
+</file>
+
+<file path=word/footer1.xml><?xml version="1.0" encoding="utf-8"?>
+<w:ftr xmlns:wpc="http://schemas.microsoft.com/office/word/2010/wordprocessingCanvas" xmlns:cx="http://schemas.microsoft.com/office/drawing/2014/chartex" xmlns:cx1="http://schemas.microsoft.com/office/drawing/2015/9/8/chartex" xmlns:cx2="http://schemas.microsoft.com/office/drawing/2015/10/21/chartex" xmlns:cx3="http://schemas.microsoft.com/office/drawing/2016/5/9/chartex" xmlns:cx4="http://schemas.microsoft.com/office/drawing/2016/5/10/chartex" xmlns:cx5="http://schemas.microsoft.com/office/drawing/2016/5/11/chartex" xmlns:cx6="http://schemas.microsoft.com/office/drawing/2016/5/12/chartex" xmlns:cx7="http://schemas.microsoft.com/office/drawing/2016/5/13/chartex" xmlns:cx8="http://schemas.microsoft.com/office/drawing/2016/5/14/chartex" xmlns:mc="http://schemas.openxmlformats.org/markup-compatibility/2006" xmlns:aink="http://schemas.microsoft.com/office/drawing/2016/ink" xmlns:am3d="http://schemas.microsoft.com/office/drawing/2017/model3d" xmlns:o="urn:schemas-microsoft-com:office:office" xmlns:r="http://schemas.openxmlformats.org/officeDocument/2006/relationships" xmlns:m="http://schemas.openxmlformats.org/officeDocument/2006/math" xmlns:v="urn:schemas-microsoft-com:vml" xmlns:wp14="http://schemas.microsoft.com/office/word/2010/wordprocessingDrawing" xmlns:wp="http://schemas.openxmlformats.org/drawingml/2006/wordprocessingDrawing" xmlns:w10="urn:schemas-microsoft-com:office:word" xmlns:w="http://schemas.openxmlformats.org/wordprocessingml/2006/main" xmlns:w14="http://schemas.microsoft.com/office/word/2010/wordml" xmlns:w15="http://schemas.microsoft.com/office/word/2012/wordml" xmlns:w16cid="http://schemas.microsoft.com/office/word/2016/wordml/cid" xmlns:w16se="http://schemas.microsoft.com/office/word/2015/wordml/symex" xmlns:wpg="http://schemas.microsoft.com/office/word/2010/wordprocessingGroup" xmlns:wpi="http://schemas.microsoft.com/office/word/2010/wordprocessingInk" xmlns:wne="http://schemas.microsoft.com/office/word/2006/wordml" xmlns:wps="http://schemas.microsoft.com/office/word/2010/wordprocessingShape" mc:Ignorable="w14 w15 w16se w16cid wp14">
+  <w:p>
+    <w:pPr>
+      <w:pStyle w:val="Pieddepage"/>
+      <w:jc w:val="right"/>
+    </w:pPr>
+    <w:r>
+      <w:t xml:space="preserve">Page </w:t>
+    </w:r>
+    <w:sdt>
+      <w:sdtPr>
+        <w:id w:val="791868582"/>
+        <w:docPartObj>
+          <w:docPartGallery w:val="Page Numbers (Bottom of Page)"/>
+          <w:docPartUnique/>
+        </w:docPartObj>
+      </w:sdtPr>
+      <w:sdtContent>
+        <w:r>
+          <w:fldChar w:fldCharType="begin"/>
+        </w:r>
+        <w:r>
+          <w:instrText>PAGE   \* MERGEFORMAT</w:instrText>
+        </w:r>
+        <w:r>
+          <w:fldChar w:fldCharType="separate"/>
+        </w:r>
+        <w:r>
+          <w:rPr>
+            <w:lang w:val="fr-FR"/>
+          </w:rPr>
+          <w:t>2</w:t>
+        </w:r>
+        <w:r>
+          <w:fldChar w:fldCharType="end"/>
+        </w:r>
+      </w:sdtContent>
+    </w:sdt>
+  </w:p>
+  <w:p>
+    <w:pPr>
+      <w:pStyle w:val="Pieddepage"/>
+    </w:pPr>
+  </w:p>
+</w:ftr>
+</file>
+
+<file path=word/footnotes.xml><?xml version="1.0" encoding="utf-8"?>
+<w:footnotes xmlns:wpc="http://schemas.microsoft.com/office/word/2010/wordprocessingCanvas" xmlns:cx="http://schemas.microsoft.com/office/drawing/2014/chartex" xmlns:cx1="http://schemas.microsoft.com/office/drawing/2015/9/8/chartex" xmlns:cx2="http://schemas.microsoft.com/office/drawing/2015/10/21/chartex" xmlns:cx3="http://schemas.microsoft.com/office/drawing/2016/5/9/chartex" xmlns:cx4="http://schemas.microsoft.com/office/drawing/2016/5/10/chartex" xmlns:cx5="http://schemas.microsoft.com/office/drawing/2016/5/11/chartex" xmlns:cx6="http://schemas.microsoft.com/office/drawing/2016/5/12/chartex" xmlns:cx7="http://schemas.microsoft.com/office/drawing/2016/5/13/chartex" xmlns:cx8="http://schemas.microsoft.com/office/drawing/2016/5/14/chartex" xmlns:mc="http://schemas.openxmlformats.org/markup-compatibility/2006" xmlns:aink="http://schemas.microsoft.com/office/drawing/2016/ink" xmlns:am3d="http://schemas.microsoft.com/office/drawing/2017/model3d" xmlns:o="urn:schemas-microsoft-com:office:office" xmlns:r="http://schemas.openxmlformats.org/officeDocument/2006/relationships" xmlns:m="http://schemas.openxmlformats.org/officeDocument/2006/math" xmlns:v="urn:schemas-microsoft-com:vml" xmlns:wp14="http://schemas.microsoft.com/office/word/2010/wordprocessingDrawing" xmlns:wp="http://schemas.openxmlformats.org/drawingml/2006/wordprocessingDrawing" xmlns:w10="urn:schemas-microsoft-com:office:word" xmlns:w="http://schemas.openxmlformats.org/wordprocessingml/2006/main" xmlns:w14="http://schemas.microsoft.com/office/word/2010/wordml" xmlns:w15="http://schemas.microsoft.com/office/word/2012/wordml" xmlns:w16cid="http://schemas.microsoft.com/office/word/2016/wordml/cid" xmlns:w16se="http://schemas.microsoft.com/office/word/2015/wordml/symex" xmlns:wpg="http://schemas.microsoft.com/office/word/2010/wordprocessingGroup" xmlns:wpi="http://schemas.microsoft.com/office/word/2010/wordprocessingInk" xmlns:wne="http://schemas.microsoft.com/office/word/2006/wordml" xmlns:wps="http://schemas.microsoft.com/office/word/2010/wordprocessingShape" mc:Ignorable="w14 w15 w16se w16cid wp14">
+  <w:footnote w:type="separator" w:id="-1">
+    <w:p>
+      <w:pPr>
+        <w:spacing w:after="0" w:line="240" w:lineRule="auto"/>
+      </w:pPr>
+      <w:r>
+        <w:separator/>
+      </w:r>
+    </w:p>
+  </w:footnote>
+  <w:footnote w:type="continuationSeparator" w:id="0">
+    <w:p>
+      <w:pPr>
+        <w:spacing w:after="0" w:line="240" w:lineRule="auto"/>
+      </w:pPr>
+      <w:r>
+        <w:continuationSeparator/>
+      </w:r>
+    </w:p>
+  </w:footnote>
+</w:footnotes>
+</file>
+
+<file path=word/header1.xml><?xml version="1.0" encoding="utf-8"?>
+<w:hdr xmlns:wpc="http://schemas.microsoft.com/office/word/2010/wordprocessingCanvas" xmlns:cx="http://schemas.microsoft.com/office/drawing/2014/chartex" xmlns:cx1="http://schemas.microsoft.com/office/drawing/2015/9/8/chartex" xmlns:cx2="http://schemas.microsoft.com/office/drawing/2015/10/21/chartex" xmlns:cx3="http://schemas.microsoft.com/office/drawing/2016/5/9/chartex" xmlns:cx4="http://schemas.microsoft.com/office/drawing/2016/5/10/chartex" xmlns:cx5="http://schemas.microsoft.com/office/drawing/2016/5/11/chartex" xmlns:cx6="http://schemas.microsoft.com/office/drawing/2016/5/12/chartex" xmlns:cx7="http://schemas.microsoft.com/office/drawing/2016/5/13/chartex" xmlns:cx8="http://schemas.microsoft.com/office/drawing/2016/5/14/chartex" xmlns:mc="http://schemas.openxmlformats.org/markup-compatibility/2006" xmlns:aink="http://schemas.microsoft.com/office/drawing/2016/ink" xmlns:am3d="http://schemas.microsoft.com/office/drawing/2017/model3d" xmlns:o="urn:schemas-microsoft-com:office:office" xmlns:r="http://schemas.openxmlformats.org/officeDocument/2006/relationships" xmlns:m="http://schemas.openxmlformats.org/officeDocument/2006/math" xmlns:v="urn:schemas-microsoft-com:vml" xmlns:wp14="http://schemas.microsoft.com/office/word/2010/wordprocessingDrawing" xmlns:wp="http://schemas.openxmlformats.org/drawingml/2006/wordprocessingDrawing" xmlns:w10="urn:schemas-microsoft-com:office:word" xmlns:w="http://schemas.openxmlformats.org/wordprocessingml/2006/main" xmlns:w14="http://schemas.microsoft.com/office/word/2010/wordml" xmlns:w15="http://schemas.microsoft.com/office/word/2012/wordml" xmlns:w16cid="http://schemas.microsoft.com/office/word/2016/wordml/cid" xmlns:w16se="http://schemas.microsoft.com/office/word/2015/wordml/symex" xmlns:wpg="http://schemas.microsoft.com/office/word/2010/wordprocessingGroup" xmlns:wpi="http://schemas.microsoft.com/office/word/2010/wordprocessingInk" xmlns:wne="http://schemas.microsoft.com/office/word/2006/wordml" xmlns:wps="http://schemas.microsoft.com/office/word/2010/wordprocessingShape" mc:Ignorable="w14 w15 w16se w16cid wp14">
+  <w:p>
+    <w:pPr>
+      <w:pStyle w:val="En-tte"/>
+      <w:rPr>
+        <w:rFonts w:ascii="Arial" w:hAnsi="Arial" w:cs="Arial"/>
+        <w:b/>
+      </w:rPr>
+    </w:pPr>
+    <w:r>
+      <w:rPr>
+        <w:rFonts w:ascii="Arial" w:hAnsi="Arial" w:cs="Arial"/>
+        <w:b/>
+        <w:noProof/>
+        <w:lang w:eastAsia="fr-CH"/>
+      </w:rPr>
+      <w:drawing>
+        <wp:anchor distT="0" distB="0" distL="114300" distR="114300" simplePos="0" relativeHeight="251664384" behindDoc="0" locked="0" layoutInCell="1" allowOverlap="1" wp14:anchorId="2559833B" wp14:editId="23FA7119">
+          <wp:simplePos x="0" y="0"/>
+          <wp:positionH relativeFrom="margin">
+            <wp:posOffset>4377055</wp:posOffset>
+          </wp:positionH>
+          <wp:positionV relativeFrom="paragraph">
+            <wp:posOffset>-182880</wp:posOffset>
+          </wp:positionV>
+          <wp:extent cx="1992630" cy="627475"/>
+          <wp:effectExtent l="0" t="0" r="7620" b="1270"/>
+          <wp:wrapNone/>
+          <wp:docPr id="2" name="Image 2" descr="https://edus2.rpn.ch/extranet/cpne/sa/com/CPNE_Logos/CPNE_TI_logo_digital_rvb_100mm.png"/>
+          <wp:cNvGraphicFramePr>
+            <a:graphicFrameLocks xmlns:a="http://schemas.openxmlformats.org/drawingml/2006/main" noChangeAspect="1"/>
+          </wp:cNvGraphicFramePr>
+          <a:graphic xmlns:a="http://schemas.openxmlformats.org/drawingml/2006/main">
+            <a:graphicData uri="http://schemas.openxmlformats.org/drawingml/2006/picture">
+              <pic:pic xmlns:pic="http://schemas.openxmlformats.org/drawingml/2006/picture">
+                <pic:nvPicPr>
+                  <pic:cNvPr id="0" name="Picture 1" descr="https://edus2.rpn.ch/extranet/cpne/sa/com/CPNE_Logos/CPNE_TI_logo_digital_rvb_100mm.png"/>
+                  <pic:cNvPicPr>
+                    <a:picLocks noChangeAspect="1" noChangeArrowheads="1"/>
+                  </pic:cNvPicPr>
+                </pic:nvPicPr>
+                <pic:blipFill>
+                  <a:blip r:embed="rId1" cstate="print">
+                    <a:extLst>
+                      <a:ext uri="{28A0092B-C50C-407E-A947-70E740481C1C}">
+                        <a14:useLocalDpi xmlns:a14="http://schemas.microsoft.com/office/drawing/2010/main" val="0"/>
+                      </a:ext>
+                    </a:extLst>
+                  </a:blip>
+                  <a:srcRect/>
+                  <a:stretch>
+                    <a:fillRect/>
+                  </a:stretch>
+                </pic:blipFill>
+                <pic:spPr bwMode="auto">
+                  <a:xfrm>
+                    <a:off x="0" y="0"/>
+                    <a:ext cx="2087567" cy="657371"/>
+                  </a:xfrm>
+                  <a:prstGeom prst="rect">
+                    <a:avLst/>
+                  </a:prstGeom>
+                  <a:noFill/>
+                  <a:ln>
+                    <a:noFill/>
+                  </a:ln>
+                </pic:spPr>
+              </pic:pic>
+            </a:graphicData>
+          </a:graphic>
+          <wp14:sizeRelH relativeFrom="margin">
+            <wp14:pctWidth>0</wp14:pctWidth>
+          </wp14:sizeRelH>
+          <wp14:sizeRelV relativeFrom="margin">
+            <wp14:pctHeight>0</wp14:pctHeight>
+          </wp14:sizeRelV>
+        </wp:anchor>
+      </w:drawing>
+    </w:r>
+  </w:p>
+</w:hdr>
+</file>
+
+<file path=word/header2.xml><?xml version="1.0" encoding="utf-8"?>
+<w:hdr xmlns:wpc="http://schemas.microsoft.com/office/word/2010/wordprocessingCanvas" xmlns:cx="http://schemas.microsoft.com/office/drawing/2014/chartex" xmlns:cx1="http://schemas.microsoft.com/office/drawing/2015/9/8/chartex" xmlns:cx2="http://schemas.microsoft.com/office/drawing/2015/10/21/chartex" xmlns:cx3="http://schemas.microsoft.com/office/drawing/2016/5/9/chartex" xmlns:cx4="http://schemas.microsoft.com/office/drawing/2016/5/10/chartex" xmlns:cx5="http://schemas.microsoft.com/office/drawing/2016/5/11/chartex" xmlns:cx6="http://schemas.microsoft.com/office/drawing/2016/5/12/chartex" xmlns:cx7="http://schemas.microsoft.com/office/drawing/2016/5/13/chartex" xmlns:cx8="http://schemas.microsoft.com/office/drawing/2016/5/14/chartex" xmlns:mc="http://schemas.openxmlformats.org/markup-compatibility/2006" xmlns:aink="http://schemas.microsoft.com/office/drawing/2016/ink" xmlns:am3d="http://schemas.microsoft.com/office/drawing/2017/model3d" xmlns:o="urn:schemas-microsoft-com:office:office" xmlns:r="http://schemas.openxmlformats.org/officeDocument/2006/relationships" xmlns:m="http://schemas.openxmlformats.org/officeDocument/2006/math" xmlns:v="urn:schemas-microsoft-com:vml" xmlns:wp14="http://schemas.microsoft.com/office/word/2010/wordprocessingDrawing" xmlns:wp="http://schemas.openxmlformats.org/drawingml/2006/wordprocessingDrawing" xmlns:w10="urn:schemas-microsoft-com:office:word" xmlns:w="http://schemas.openxmlformats.org/wordprocessingml/2006/main" xmlns:w14="http://schemas.microsoft.com/office/word/2010/wordml" xmlns:w15="http://schemas.microsoft.com/office/word/2012/wordml" xmlns:w16cid="http://schemas.microsoft.com/office/word/2016/wordml/cid" xmlns:w16se="http://schemas.microsoft.com/office/word/2015/wordml/symex" xmlns:wpg="http://schemas.microsoft.com/office/word/2010/wordprocessingGroup" xmlns:wpi="http://schemas.microsoft.com/office/word/2010/wordprocessingInk" xmlns:wne="http://schemas.microsoft.com/office/word/2006/wordml" xmlns:wps="http://schemas.microsoft.com/office/word/2010/wordprocessingShape" mc:Ignorable="w14 w15 w16se w16cid wp14">
+  <w:p>
+    <w:pPr>
+      <w:pStyle w:val="En-tte"/>
+    </w:pPr>
+    <w:r>
+      <w:rPr>
+        <w:noProof/>
+        <w:lang w:eastAsia="fr-CH"/>
+      </w:rPr>
+      <w:drawing>
+        <wp:anchor distT="0" distB="0" distL="114300" distR="114300" simplePos="0" relativeHeight="251666432" behindDoc="0" locked="0" layoutInCell="1" allowOverlap="1" wp14:anchorId="006B0E3B" wp14:editId="6A94AA64">
+          <wp:simplePos x="0" y="0"/>
+          <wp:positionH relativeFrom="margin">
+            <wp:posOffset>4388933</wp:posOffset>
+          </wp:positionH>
+          <wp:positionV relativeFrom="paragraph">
+            <wp:posOffset>-181610</wp:posOffset>
+          </wp:positionV>
+          <wp:extent cx="1992630" cy="627475"/>
+          <wp:effectExtent l="0" t="0" r="7620" b="1270"/>
+          <wp:wrapNone/>
+          <wp:docPr id="5" name="Image 5" descr="https://edus2.rpn.ch/extranet/cpne/sa/com/CPNE_Logos/CPNE_TI_logo_digital_rvb_100mm.png"/>
+          <wp:cNvGraphicFramePr>
+            <a:graphicFrameLocks xmlns:a="http://schemas.openxmlformats.org/drawingml/2006/main" noChangeAspect="1"/>
+          </wp:cNvGraphicFramePr>
+          <a:graphic xmlns:a="http://schemas.openxmlformats.org/drawingml/2006/main">
+            <a:graphicData uri="http://schemas.openxmlformats.org/drawingml/2006/picture">
+              <pic:pic xmlns:pic="http://schemas.openxmlformats.org/drawingml/2006/picture">
+                <pic:nvPicPr>
+                  <pic:cNvPr id="0" name="Picture 1" descr="https://edus2.rpn.ch/extranet/cpne/sa/com/CPNE_Logos/CPNE_TI_logo_digital_rvb_100mm.png"/>
+                  <pic:cNvPicPr>
+                    <a:picLocks noChangeAspect="1" noChangeArrowheads="1"/>
+                  </pic:cNvPicPr>
+                </pic:nvPicPr>
+                <pic:blipFill>
+                  <a:blip r:embed="rId1" cstate="print">
+                    <a:extLst>
+                      <a:ext uri="{28A0092B-C50C-407E-A947-70E740481C1C}">
+                        <a14:useLocalDpi xmlns:a14="http://schemas.microsoft.com/office/drawing/2010/main" val="0"/>
+                      </a:ext>
+                    </a:extLst>
+                  </a:blip>
+                  <a:srcRect/>
+                  <a:stretch>
+                    <a:fillRect/>
+                  </a:stretch>
+                </pic:blipFill>
+                <pic:spPr bwMode="auto">
+                  <a:xfrm>
+                    <a:off x="0" y="0"/>
+                    <a:ext cx="1992630" cy="627475"/>
+                  </a:xfrm>
+                  <a:prstGeom prst="rect">
+                    <a:avLst/>
+                  </a:prstGeom>
+                  <a:noFill/>
+                  <a:ln>
+                    <a:noFill/>
+                  </a:ln>
+                </pic:spPr>
+              </pic:pic>
+            </a:graphicData>
+          </a:graphic>
+          <wp14:sizeRelH relativeFrom="margin">
+            <wp14:pctWidth>0</wp14:pctWidth>
+          </wp14:sizeRelH>
+          <wp14:sizeRelV relativeFrom="margin">
+            <wp14:pctHeight>0</wp14:pctHeight>
+          </wp14:sizeRelV>
+        </wp:anchor>
+      </w:drawing>
+    </w:r>
+  </w:p>
+</w:hdr>
 </file>
 
 <file path=word/numbering.xml><?xml version="1.0" encoding="utf-8"?>
@@ -1401,8 +1870,240 @@
       </w:pPr>
     </w:lvl>
   </w:abstractNum>
+  <w:abstractNum w:abstractNumId="1" w15:restartNumberingAfterBreak="0">
+    <w:nsid w:val="20981DED"/>
+    <w:multiLevelType w:val="hybridMultilevel"/>
+    <w:tmpl w:val="96E09A1C"/>
+    <w:lvl w:ilvl="0" w:tplc="100C0001">
+      <w:start w:val="1"/>
+      <w:numFmt w:val="bullet"/>
+      <w:lvlText w:val=""/>
+      <w:lvlJc w:val="left"/>
+      <w:pPr>
+        <w:ind w:left="720" w:hanging="360"/>
+      </w:pPr>
+      <w:rPr>
+        <w:rFonts w:ascii="Symbol" w:hAnsi="Symbol" w:hint="default"/>
+      </w:rPr>
+    </w:lvl>
+    <w:lvl w:ilvl="1" w:tplc="100C0003" w:tentative="1">
+      <w:start w:val="1"/>
+      <w:numFmt w:val="bullet"/>
+      <w:lvlText w:val="o"/>
+      <w:lvlJc w:val="left"/>
+      <w:pPr>
+        <w:ind w:left="1440" w:hanging="360"/>
+      </w:pPr>
+      <w:rPr>
+        <w:rFonts w:ascii="Courier New" w:hAnsi="Courier New" w:cs="Courier New" w:hint="default"/>
+      </w:rPr>
+    </w:lvl>
+    <w:lvl w:ilvl="2" w:tplc="100C0005" w:tentative="1">
+      <w:start w:val="1"/>
+      <w:numFmt w:val="bullet"/>
+      <w:lvlText w:val=""/>
+      <w:lvlJc w:val="left"/>
+      <w:pPr>
+        <w:ind w:left="2160" w:hanging="360"/>
+      </w:pPr>
+      <w:rPr>
+        <w:rFonts w:ascii="Wingdings" w:hAnsi="Wingdings" w:hint="default"/>
+      </w:rPr>
+    </w:lvl>
+    <w:lvl w:ilvl="3" w:tplc="100C0001" w:tentative="1">
+      <w:start w:val="1"/>
+      <w:numFmt w:val="bullet"/>
+      <w:lvlText w:val=""/>
+      <w:lvlJc w:val="left"/>
+      <w:pPr>
+        <w:ind w:left="2880" w:hanging="360"/>
+      </w:pPr>
+      <w:rPr>
+        <w:rFonts w:ascii="Symbol" w:hAnsi="Symbol" w:hint="default"/>
+      </w:rPr>
+    </w:lvl>
+    <w:lvl w:ilvl="4" w:tplc="100C0003" w:tentative="1">
+      <w:start w:val="1"/>
+      <w:numFmt w:val="bullet"/>
+      <w:lvlText w:val="o"/>
+      <w:lvlJc w:val="left"/>
+      <w:pPr>
+        <w:ind w:left="3600" w:hanging="360"/>
+      </w:pPr>
+      <w:rPr>
+        <w:rFonts w:ascii="Courier New" w:hAnsi="Courier New" w:cs="Courier New" w:hint="default"/>
+      </w:rPr>
+    </w:lvl>
+    <w:lvl w:ilvl="5" w:tplc="100C0005" w:tentative="1">
+      <w:start w:val="1"/>
+      <w:numFmt w:val="bullet"/>
+      <w:lvlText w:val=""/>
+      <w:lvlJc w:val="left"/>
+      <w:pPr>
+        <w:ind w:left="4320" w:hanging="360"/>
+      </w:pPr>
+      <w:rPr>
+        <w:rFonts w:ascii="Wingdings" w:hAnsi="Wingdings" w:hint="default"/>
+      </w:rPr>
+    </w:lvl>
+    <w:lvl w:ilvl="6" w:tplc="100C0001" w:tentative="1">
+      <w:start w:val="1"/>
+      <w:numFmt w:val="bullet"/>
+      <w:lvlText w:val=""/>
+      <w:lvlJc w:val="left"/>
+      <w:pPr>
+        <w:ind w:left="5040" w:hanging="360"/>
+      </w:pPr>
+      <w:rPr>
+        <w:rFonts w:ascii="Symbol" w:hAnsi="Symbol" w:hint="default"/>
+      </w:rPr>
+    </w:lvl>
+    <w:lvl w:ilvl="7" w:tplc="100C0003" w:tentative="1">
+      <w:start w:val="1"/>
+      <w:numFmt w:val="bullet"/>
+      <w:lvlText w:val="o"/>
+      <w:lvlJc w:val="left"/>
+      <w:pPr>
+        <w:ind w:left="5760" w:hanging="360"/>
+      </w:pPr>
+      <w:rPr>
+        <w:rFonts w:ascii="Courier New" w:hAnsi="Courier New" w:cs="Courier New" w:hint="default"/>
+      </w:rPr>
+    </w:lvl>
+    <w:lvl w:ilvl="8" w:tplc="100C0005" w:tentative="1">
+      <w:start w:val="1"/>
+      <w:numFmt w:val="bullet"/>
+      <w:lvlText w:val=""/>
+      <w:lvlJc w:val="left"/>
+      <w:pPr>
+        <w:ind w:left="6480" w:hanging="360"/>
+      </w:pPr>
+      <w:rPr>
+        <w:rFonts w:ascii="Wingdings" w:hAnsi="Wingdings" w:hint="default"/>
+      </w:rPr>
+    </w:lvl>
+  </w:abstractNum>
+  <w:abstractNum w:abstractNumId="2" w15:restartNumberingAfterBreak="0">
+    <w:nsid w:val="56A77F7D"/>
+    <w:multiLevelType w:val="hybridMultilevel"/>
+    <w:tmpl w:val="64F45668"/>
+    <w:lvl w:ilvl="0" w:tplc="100C0001">
+      <w:start w:val="1"/>
+      <w:numFmt w:val="bullet"/>
+      <w:lvlText w:val=""/>
+      <w:lvlJc w:val="left"/>
+      <w:pPr>
+        <w:ind w:left="720" w:hanging="360"/>
+      </w:pPr>
+      <w:rPr>
+        <w:rFonts w:ascii="Symbol" w:hAnsi="Symbol" w:hint="default"/>
+      </w:rPr>
+    </w:lvl>
+    <w:lvl w:ilvl="1" w:tplc="100C0003" w:tentative="1">
+      <w:start w:val="1"/>
+      <w:numFmt w:val="bullet"/>
+      <w:lvlText w:val="o"/>
+      <w:lvlJc w:val="left"/>
+      <w:pPr>
+        <w:ind w:left="1440" w:hanging="360"/>
+      </w:pPr>
+      <w:rPr>
+        <w:rFonts w:ascii="Courier New" w:hAnsi="Courier New" w:cs="Courier New" w:hint="default"/>
+      </w:rPr>
+    </w:lvl>
+    <w:lvl w:ilvl="2" w:tplc="100C0005" w:tentative="1">
+      <w:start w:val="1"/>
+      <w:numFmt w:val="bullet"/>
+      <w:lvlText w:val=""/>
+      <w:lvlJc w:val="left"/>
+      <w:pPr>
+        <w:ind w:left="2160" w:hanging="360"/>
+      </w:pPr>
+      <w:rPr>
+        <w:rFonts w:ascii="Wingdings" w:hAnsi="Wingdings" w:hint="default"/>
+      </w:rPr>
+    </w:lvl>
+    <w:lvl w:ilvl="3" w:tplc="100C0001" w:tentative="1">
+      <w:start w:val="1"/>
+      <w:numFmt w:val="bullet"/>
+      <w:lvlText w:val=""/>
+      <w:lvlJc w:val="left"/>
+      <w:pPr>
+        <w:ind w:left="2880" w:hanging="360"/>
+      </w:pPr>
+      <w:rPr>
+        <w:rFonts w:ascii="Symbol" w:hAnsi="Symbol" w:hint="default"/>
+      </w:rPr>
+    </w:lvl>
+    <w:lvl w:ilvl="4" w:tplc="100C0003" w:tentative="1">
+      <w:start w:val="1"/>
+      <w:numFmt w:val="bullet"/>
+      <w:lvlText w:val="o"/>
+      <w:lvlJc w:val="left"/>
+      <w:pPr>
+        <w:ind w:left="3600" w:hanging="360"/>
+      </w:pPr>
+      <w:rPr>
+        <w:rFonts w:ascii="Courier New" w:hAnsi="Courier New" w:cs="Courier New" w:hint="default"/>
+      </w:rPr>
+    </w:lvl>
+    <w:lvl w:ilvl="5" w:tplc="100C0005" w:tentative="1">
+      <w:start w:val="1"/>
+      <w:numFmt w:val="bullet"/>
+      <w:lvlText w:val=""/>
+      <w:lvlJc w:val="left"/>
+      <w:pPr>
+        <w:ind w:left="4320" w:hanging="360"/>
+      </w:pPr>
+      <w:rPr>
+        <w:rFonts w:ascii="Wingdings" w:hAnsi="Wingdings" w:hint="default"/>
+      </w:rPr>
+    </w:lvl>
+    <w:lvl w:ilvl="6" w:tplc="100C0001" w:tentative="1">
+      <w:start w:val="1"/>
+      <w:numFmt w:val="bullet"/>
+      <w:lvlText w:val=""/>
+      <w:lvlJc w:val="left"/>
+      <w:pPr>
+        <w:ind w:left="5040" w:hanging="360"/>
+      </w:pPr>
+      <w:rPr>
+        <w:rFonts w:ascii="Symbol" w:hAnsi="Symbol" w:hint="default"/>
+      </w:rPr>
+    </w:lvl>
+    <w:lvl w:ilvl="7" w:tplc="100C0003" w:tentative="1">
+      <w:start w:val="1"/>
+      <w:numFmt w:val="bullet"/>
+      <w:lvlText w:val="o"/>
+      <w:lvlJc w:val="left"/>
+      <w:pPr>
+        <w:ind w:left="5760" w:hanging="360"/>
+      </w:pPr>
+      <w:rPr>
+        <w:rFonts w:ascii="Courier New" w:hAnsi="Courier New" w:cs="Courier New" w:hint="default"/>
+      </w:rPr>
+    </w:lvl>
+    <w:lvl w:ilvl="8" w:tplc="100C0005" w:tentative="1">
+      <w:start w:val="1"/>
+      <w:numFmt w:val="bullet"/>
+      <w:lvlText w:val=""/>
+      <w:lvlJc w:val="left"/>
+      <w:pPr>
+        <w:ind w:left="6480" w:hanging="360"/>
+      </w:pPr>
+      <w:rPr>
+        <w:rFonts w:ascii="Wingdings" w:hAnsi="Wingdings" w:hint="default"/>
+      </w:rPr>
+    </w:lvl>
+  </w:abstractNum>
   <w:num w:numId="1">
     <w:abstractNumId w:val="0"/>
+  </w:num>
+  <w:num w:numId="2">
+    <w:abstractNumId w:val="2"/>
+  </w:num>
+  <w:num w:numId="3">
+    <w:abstractNumId w:val="1"/>
   </w:num>
 </w:numbering>
 </file>
@@ -1984,6 +2685,85 @@
       <w:u w:val="single"/>
     </w:rPr>
   </w:style>
+  <w:style w:type="paragraph" w:styleId="En-tte">
+    <w:name w:val="header"/>
+    <w:basedOn w:val="Normal"/>
+    <w:link w:val="En-tteCar"/>
+    <w:uiPriority w:val="99"/>
+    <w:unhideWhenUsed/>
+    <w:rsid w:val="00FF32B4"/>
+    <w:pPr>
+      <w:tabs>
+        <w:tab w:val="center" w:pos="4536"/>
+        <w:tab w:val="right" w:pos="9072"/>
+      </w:tabs>
+      <w:spacing w:after="0" w:line="240" w:lineRule="auto"/>
+    </w:pPr>
+  </w:style>
+  <w:style w:type="character" w:customStyle="1" w:styleId="En-tteCar">
+    <w:name w:val="En-tête Car"/>
+    <w:basedOn w:val="Policepardfaut"/>
+    <w:link w:val="En-tte"/>
+    <w:uiPriority w:val="99"/>
+    <w:rsid w:val="00FF32B4"/>
+  </w:style>
+  <w:style w:type="paragraph" w:styleId="Pieddepage">
+    <w:name w:val="footer"/>
+    <w:basedOn w:val="Normal"/>
+    <w:link w:val="PieddepageCar"/>
+    <w:uiPriority w:val="99"/>
+    <w:unhideWhenUsed/>
+    <w:rsid w:val="00FF32B4"/>
+    <w:pPr>
+      <w:tabs>
+        <w:tab w:val="center" w:pos="4536"/>
+        <w:tab w:val="right" w:pos="9072"/>
+      </w:tabs>
+      <w:spacing w:after="0" w:line="240" w:lineRule="auto"/>
+    </w:pPr>
+  </w:style>
+  <w:style w:type="character" w:customStyle="1" w:styleId="PieddepageCar">
+    <w:name w:val="Pied de page Car"/>
+    <w:basedOn w:val="Policepardfaut"/>
+    <w:link w:val="Pieddepage"/>
+    <w:uiPriority w:val="99"/>
+    <w:rsid w:val="00FF32B4"/>
+  </w:style>
+  <w:style w:type="character" w:styleId="Mentionnonrsolue">
+    <w:name w:val="Unresolved Mention"/>
+    <w:basedOn w:val="Policepardfaut"/>
+    <w:uiPriority w:val="99"/>
+    <w:semiHidden/>
+    <w:unhideWhenUsed/>
+    <w:rsid w:val="002875F0"/>
+    <w:rPr>
+      <w:color w:val="605E5C"/>
+      <w:shd w:val="clear" w:color="auto" w:fill="E1DFDD"/>
+    </w:rPr>
+  </w:style>
+  <w:style w:type="paragraph" w:styleId="Paragraphedeliste">
+    <w:name w:val="List Paragraph"/>
+    <w:basedOn w:val="Normal"/>
+    <w:uiPriority w:val="34"/>
+    <w:qFormat/>
+    <w:rsid w:val="009C78A6"/>
+    <w:pPr>
+      <w:ind w:left="720"/>
+      <w:contextualSpacing/>
+    </w:pPr>
+  </w:style>
+  <w:style w:type="character" w:styleId="Lienhypertextesuivivisit">
+    <w:name w:val="FollowedHyperlink"/>
+    <w:basedOn w:val="Policepardfaut"/>
+    <w:uiPriority w:val="99"/>
+    <w:semiHidden/>
+    <w:unhideWhenUsed/>
+    <w:rsid w:val="00507DAB"/>
+    <w:rPr>
+      <w:color w:val="954F72" w:themeColor="followedHyperlink"/>
+      <w:u w:val="single"/>
+    </w:rPr>
+  </w:style>
 </w:styles>
 </file>
 
@@ -2287,7 +3067,7 @@
 </file>
 
 <file path=customXml/itemProps1.xml><?xml version="1.0" encoding="utf-8"?>
-<ds:datastoreItem xmlns:ds="http://schemas.openxmlformats.org/officeDocument/2006/customXml" ds:itemID="{16474489-A555-4572-97FA-4986AE47FAFF}">
+<ds:datastoreItem xmlns:ds="http://schemas.openxmlformats.org/officeDocument/2006/customXml" ds:itemID="{5F386AB9-EA7C-4534-A5F4-97EE54071BD1}">
   <ds:schemaRefs>
     <ds:schemaRef ds:uri="http://schemas.openxmlformats.org/officeDocument/2006/bibliography"/>
   </ds:schemaRefs>

</xml_diff>

<commit_message>
Report, added behaviour for floating obstacles
</commit_message>
<xml_diff>
--- a/Doc/Rapport_PRE-TPI.docx
+++ b/Doc/Rapport_PRE-TPI.docx
@@ -2357,7 +2357,43 @@
         <w:rPr>
           <w:b/>
         </w:rPr>
-        <w:t>Définition d’orthographique :</w:t>
+        <w:t>Définition</w:t>
+      </w:r>
+      <w:r>
+        <w:rPr>
+          <w:b/>
+        </w:rPr>
+        <w:t xml:space="preserve"> </w:t>
+      </w:r>
+      <w:r>
+        <w:rPr>
+          <w:b/>
+        </w:rPr>
+        <w:t>« </w:t>
+      </w:r>
+      <w:r>
+        <w:rPr>
+          <w:b/>
+        </w:rPr>
+        <w:t>orthographique</w:t>
+      </w:r>
+      <w:r>
+        <w:rPr>
+          <w:b/>
+        </w:rPr>
+        <w:t xml:space="preserve"> </w:t>
+      </w:r>
+      <w:r>
+        <w:rPr>
+          <w:b/>
+        </w:rPr>
+        <w:t>»</w:t>
+      </w:r>
+      <w:r>
+        <w:rPr>
+          <w:b/>
+        </w:rPr>
+        <w:t> :</w:t>
       </w:r>
     </w:p>
     <w:p>
@@ -2373,7 +2409,7 @@
         <mc:AlternateContent>
           <mc:Choice Requires="wps">
             <w:drawing>
-              <wp:anchor distT="0" distB="0" distL="114300" distR="114300" simplePos="0" relativeHeight="251671552" behindDoc="0" locked="0" layoutInCell="1" allowOverlap="1" wp14:anchorId="66E1398E" wp14:editId="67B76262">
+              <wp:anchor distT="0" distB="0" distL="114300" distR="114300" simplePos="0" relativeHeight="251671552" behindDoc="0" locked="0" layoutInCell="1" allowOverlap="1" wp14:anchorId="66E1398E" wp14:editId="156BB0F1">
                 <wp:simplePos x="0" y="0"/>
                 <wp:positionH relativeFrom="column">
                   <wp:posOffset>0</wp:posOffset>
@@ -2417,14 +2453,27 @@
                             <w:r>
                               <w:t xml:space="preserve">Figure </w:t>
                             </w:r>
-                            <w:fldSimple w:instr=" SEQ Figure \* ARABIC ">
-                              <w:r>
-                                <w:rPr>
-                                  <w:noProof/>
-                                </w:rPr>
-                                <w:t>1</w:t>
-                              </w:r>
-                            </w:fldSimple>
+                            <w:r>
+                              <w:fldChar w:fldCharType="begin"/>
+                            </w:r>
+                            <w:r>
+                              <w:instrText xml:space="preserve"> SEQ Figure \* ARABIC </w:instrText>
+                            </w:r>
+                            <w:r>
+                              <w:fldChar w:fldCharType="separate"/>
+                            </w:r>
+                            <w:r>
+                              <w:rPr>
+                                <w:noProof/>
+                              </w:rPr>
+                              <w:t>1</w:t>
+                            </w:r>
+                            <w:r>
+                              <w:rPr>
+                                <w:noProof/>
+                              </w:rPr>
+                              <w:fldChar w:fldCharType="end"/>
+                            </w:r>
                             <w:r>
                               <w:t xml:space="preserve"> : Angles de caméra à plat.</w:t>
                             </w:r>
@@ -2462,14 +2511,27 @@
                       <w:r>
                         <w:t xml:space="preserve">Figure </w:t>
                       </w:r>
-                      <w:fldSimple w:instr=" SEQ Figure \* ARABIC ">
-                        <w:r>
-                          <w:rPr>
-                            <w:noProof/>
-                          </w:rPr>
-                          <w:t>1</w:t>
-                        </w:r>
-                      </w:fldSimple>
+                      <w:r>
+                        <w:fldChar w:fldCharType="begin"/>
+                      </w:r>
+                      <w:r>
+                        <w:instrText xml:space="preserve"> SEQ Figure \* ARABIC </w:instrText>
+                      </w:r>
+                      <w:r>
+                        <w:fldChar w:fldCharType="separate"/>
+                      </w:r>
+                      <w:r>
+                        <w:rPr>
+                          <w:noProof/>
+                        </w:rPr>
+                        <w:t>1</w:t>
+                      </w:r>
+                      <w:r>
+                        <w:rPr>
+                          <w:noProof/>
+                        </w:rPr>
+                        <w:fldChar w:fldCharType="end"/>
+                      </w:r>
                       <w:r>
                         <w:t xml:space="preserve"> : Angles de caméra à plat.</w:t>
                       </w:r>
@@ -2593,14 +2655,27 @@
                             <w:r>
                               <w:t xml:space="preserve">Figure </w:t>
                             </w:r>
-                            <w:fldSimple w:instr=" SEQ Figure \* ARABIC ">
-                              <w:r>
-                                <w:rPr>
-                                  <w:noProof/>
-                                </w:rPr>
-                                <w:t>2</w:t>
-                              </w:r>
-                            </w:fldSimple>
+                            <w:r>
+                              <w:fldChar w:fldCharType="begin"/>
+                            </w:r>
+                            <w:r>
+                              <w:instrText xml:space="preserve"> SEQ Figure \* ARABIC </w:instrText>
+                            </w:r>
+                            <w:r>
+                              <w:fldChar w:fldCharType="separate"/>
+                            </w:r>
+                            <w:r>
+                              <w:rPr>
+                                <w:noProof/>
+                              </w:rPr>
+                              <w:t>2</w:t>
+                            </w:r>
+                            <w:r>
+                              <w:rPr>
+                                <w:noProof/>
+                              </w:rPr>
+                              <w:fldChar w:fldCharType="end"/>
+                            </w:r>
                             <w:r>
                               <w:t xml:space="preserve"> : </w:t>
                             </w:r>
@@ -2648,14 +2723,27 @@
                       <w:r>
                         <w:t xml:space="preserve">Figure </w:t>
                       </w:r>
-                      <w:fldSimple w:instr=" SEQ Figure \* ARABIC ">
-                        <w:r>
-                          <w:rPr>
-                            <w:noProof/>
-                          </w:rPr>
-                          <w:t>2</w:t>
-                        </w:r>
-                      </w:fldSimple>
+                      <w:r>
+                        <w:fldChar w:fldCharType="begin"/>
+                      </w:r>
+                      <w:r>
+                        <w:instrText xml:space="preserve"> SEQ Figure \* ARABIC </w:instrText>
+                      </w:r>
+                      <w:r>
+                        <w:fldChar w:fldCharType="separate"/>
+                      </w:r>
+                      <w:r>
+                        <w:rPr>
+                          <w:noProof/>
+                        </w:rPr>
+                        <w:t>2</w:t>
+                      </w:r>
+                      <w:r>
+                        <w:rPr>
+                          <w:noProof/>
+                        </w:rPr>
+                        <w:fldChar w:fldCharType="end"/>
+                      </w:r>
                       <w:r>
                         <w:t xml:space="preserve"> : </w:t>
                       </w:r>
@@ -2759,7 +2847,20 @@
         <w:rPr>
           <w:i/>
         </w:rPr>
-        <w:t xml:space="preserve">la vue orthographique est la </w:t>
+        <w:t xml:space="preserve">la vue </w:t>
+      </w:r>
+      <w:r>
+        <w:rPr>
+          <w:b/>
+          <w:i/>
+        </w:rPr>
+        <w:t>orthographique</w:t>
+      </w:r>
+      <w:r>
+        <w:rPr>
+          <w:i/>
+        </w:rPr>
+        <w:t xml:space="preserve"> est la </w:t>
       </w:r>
       <w:r>
         <w:rPr>
@@ -2849,22 +2950,29 @@
                             <w:r>
                               <w:t xml:space="preserve">Figure </w:t>
                             </w:r>
-                            <w:fldSimple w:instr=" SEQ Figure \* ARABIC ">
-                              <w:r>
-                                <w:rPr>
-                                  <w:noProof/>
-                                </w:rPr>
-                                <w:t>3</w:t>
-                              </w:r>
-                            </w:fldSimple>
                             <w:r>
-                              <w:t xml:space="preserve"> : Angles de caméra </w:t>
+                              <w:fldChar w:fldCharType="begin"/>
                             </w:r>
                             <w:r>
-                              <w:t>en</w:t>
+                              <w:instrText xml:space="preserve"> SEQ Figure \* ARABIC </w:instrText>
                             </w:r>
                             <w:r>
-                              <w:t xml:space="preserve"> 3D</w:t>
+                              <w:fldChar w:fldCharType="separate"/>
+                            </w:r>
+                            <w:r>
+                              <w:rPr>
+                                <w:noProof/>
+                              </w:rPr>
+                              <w:t>3</w:t>
+                            </w:r>
+                            <w:r>
+                              <w:rPr>
+                                <w:noProof/>
+                              </w:rPr>
+                              <w:fldChar w:fldCharType="end"/>
+                            </w:r>
+                            <w:r>
+                              <w:t xml:space="preserve"> : Angles de caméra</w:t>
                             </w:r>
                           </w:p>
                         </w:txbxContent>
@@ -2896,22 +3004,29 @@
                       <w:r>
                         <w:t xml:space="preserve">Figure </w:t>
                       </w:r>
-                      <w:fldSimple w:instr=" SEQ Figure \* ARABIC ">
-                        <w:r>
-                          <w:rPr>
-                            <w:noProof/>
-                          </w:rPr>
-                          <w:t>3</w:t>
-                        </w:r>
-                      </w:fldSimple>
                       <w:r>
-                        <w:t xml:space="preserve"> : Angles de caméra </w:t>
+                        <w:fldChar w:fldCharType="begin"/>
                       </w:r>
                       <w:r>
-                        <w:t>en</w:t>
+                        <w:instrText xml:space="preserve"> SEQ Figure \* ARABIC </w:instrText>
                       </w:r>
                       <w:r>
-                        <w:t xml:space="preserve"> 3D</w:t>
+                        <w:fldChar w:fldCharType="separate"/>
+                      </w:r>
+                      <w:r>
+                        <w:rPr>
+                          <w:noProof/>
+                        </w:rPr>
+                        <w:t>3</w:t>
+                      </w:r>
+                      <w:r>
+                        <w:rPr>
+                          <w:noProof/>
+                        </w:rPr>
+                        <w:fldChar w:fldCharType="end"/>
+                      </w:r>
+                      <w:r>
+                        <w:t xml:space="preserve"> : Angles de caméra</w:t>
                       </w:r>
                     </w:p>
                   </w:txbxContent>
@@ -2983,7 +3098,34 @@
         </w:drawing>
       </w:r>
       <w:r>
-        <w:t xml:space="preserve">Lorsque le joueur clique sur la touche « E », le point de vue de la caméra, toujours centrée sur le joueur, tourne de 90 degrés. </w:t>
+        <w:t>Lorsque le joueur clique sur la touche « </w:t>
+      </w:r>
+      <w:r>
+        <w:rPr>
+          <w:b/>
+        </w:rPr>
+        <w:t>E</w:t>
+      </w:r>
+      <w:r>
+        <w:t xml:space="preserve"> », le point de vue de la caméra, toujours centrée sur le joueur, </w:t>
+      </w:r>
+      <w:r>
+        <w:rPr>
+          <w:b/>
+        </w:rPr>
+        <w:t>se déplace</w:t>
+      </w:r>
+      <w:r>
+        <w:rPr>
+          <w:b/>
+        </w:rPr>
+        <w:t xml:space="preserve"> de 90 degrés</w:t>
+      </w:r>
+      <w:r>
+        <w:t xml:space="preserve"> dans un cercle</w:t>
+      </w:r>
+      <w:r>
+        <w:t xml:space="preserve">. </w:t>
       </w:r>
       <w:r>
         <w:t xml:space="preserve">Voici </w:t>
@@ -3028,209 +3170,13 @@
         <mc:AlternateContent>
           <mc:Choice Requires="wps">
             <w:drawing>
-              <wp:anchor distT="0" distB="0" distL="114300" distR="114300" simplePos="0" relativeHeight="251677696" behindDoc="0" locked="0" layoutInCell="1" allowOverlap="1" wp14:anchorId="7E0FF89B" wp14:editId="52261BDE">
+              <wp:anchor distT="0" distB="0" distL="114300" distR="114300" simplePos="0" relativeHeight="251675648" behindDoc="0" locked="0" layoutInCell="1" allowOverlap="1" wp14:anchorId="231B1B0B" wp14:editId="0729EE2B">
                 <wp:simplePos x="0" y="0"/>
                 <wp:positionH relativeFrom="column">
-                  <wp:posOffset>3188970</wp:posOffset>
+                  <wp:posOffset>1604010</wp:posOffset>
                 </wp:positionH>
                 <wp:positionV relativeFrom="paragraph">
-                  <wp:posOffset>2656217</wp:posOffset>
-                </wp:positionV>
-                <wp:extent cx="2468245" cy="635"/>
-                <wp:effectExtent l="0" t="0" r="0" b="0"/>
-                <wp:wrapTopAndBottom/>
-                <wp:docPr id="21" name="Zone de texte 21"/>
-                <wp:cNvGraphicFramePr/>
-                <a:graphic xmlns:a="http://schemas.openxmlformats.org/drawingml/2006/main">
-                  <a:graphicData uri="http://schemas.microsoft.com/office/word/2010/wordprocessingShape">
-                    <wps:wsp>
-                      <wps:cNvSpPr txBox="1"/>
-                      <wps:spPr>
-                        <a:xfrm>
-                          <a:off x="0" y="0"/>
-                          <a:ext cx="2468245" cy="635"/>
-                        </a:xfrm>
-                        <a:prstGeom prst="rect">
-                          <a:avLst/>
-                        </a:prstGeom>
-                        <a:solidFill>
-                          <a:prstClr val="white"/>
-                        </a:solidFill>
-                        <a:ln>
-                          <a:noFill/>
-                        </a:ln>
-                      </wps:spPr>
-                      <wps:txbx>
-                        <w:txbxContent>
-                          <w:p>
-                            <w:pPr>
-                              <w:pStyle w:val="Lgende"/>
-                              <w:rPr>
-                                <w:noProof/>
-                              </w:rPr>
-                            </w:pPr>
-                            <w:r>
-                              <w:t xml:space="preserve">Figure </w:t>
-                            </w:r>
-                            <w:fldSimple w:instr=" SEQ Figure \* ARABIC ">
-                              <w:r>
-                                <w:rPr>
-                                  <w:noProof/>
-                                </w:rPr>
-                                <w:t>4</w:t>
-                              </w:r>
-                            </w:fldSimple>
-                            <w:r>
-                              <w:t xml:space="preserve"> : To</w:t>
-                            </w:r>
-                            <w:bookmarkStart w:id="17" w:name="_GoBack"/>
-                            <w:bookmarkEnd w:id="17"/>
-                            <w:r>
-                              <w:t>utes les positions possibles de la caméra.</w:t>
-                            </w:r>
-                          </w:p>
-                        </w:txbxContent>
-                      </wps:txbx>
-                      <wps:bodyPr rot="0" spcFirstLastPara="0" vertOverflow="overflow" horzOverflow="overflow" vert="horz" wrap="square" lIns="0" tIns="0" rIns="0" bIns="0" numCol="1" spcCol="0" rtlCol="0" fromWordArt="0" anchor="t" anchorCtr="0" forceAA="0" compatLnSpc="1">
-                        <a:prstTxWarp prst="textNoShape">
-                          <a:avLst/>
-                        </a:prstTxWarp>
-                        <a:spAutoFit/>
-                      </wps:bodyPr>
-                    </wps:wsp>
-                  </a:graphicData>
-                </a:graphic>
-              </wp:anchor>
-            </w:drawing>
-          </mc:Choice>
-          <mc:Fallback>
-            <w:pict>
-              <v:shape w14:anchorId="7E0FF89B" id="Zone de texte 21" o:spid="_x0000_s1029" type="#_x0000_t202" style="position:absolute;margin-left:251.1pt;margin-top:209.15pt;width:194.35pt;height:.05pt;z-index:251677696;visibility:visible;mso-wrap-style:square;mso-wrap-distance-left:9pt;mso-wrap-distance-top:0;mso-wrap-distance-right:9pt;mso-wrap-distance-bottom:0;mso-position-horizontal:absolute;mso-position-horizontal-relative:text;mso-position-vertical:absolute;mso-position-vertical-relative:text;v-text-anchor:top" o:gfxdata="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" stroked="f">
-                <v:textbox style="mso-fit-shape-to-text:t" inset="0,0,0,0">
-                  <w:txbxContent>
-                    <w:p>
-                      <w:pPr>
-                        <w:pStyle w:val="Lgende"/>
-                        <w:rPr>
-                          <w:noProof/>
-                        </w:rPr>
-                      </w:pPr>
-                      <w:r>
-                        <w:t xml:space="preserve">Figure </w:t>
-                      </w:r>
-                      <w:fldSimple w:instr=" SEQ Figure \* ARABIC ">
-                        <w:r>
-                          <w:rPr>
-                            <w:noProof/>
-                          </w:rPr>
-                          <w:t>4</w:t>
-                        </w:r>
-                      </w:fldSimple>
-                      <w:r>
-                        <w:t xml:space="preserve"> : To</w:t>
-                      </w:r>
-                      <w:bookmarkStart w:id="18" w:name="_GoBack"/>
-                      <w:bookmarkEnd w:id="18"/>
-                      <w:r>
-                        <w:t>utes les positions possibles de la caméra.</w:t>
-                      </w:r>
-                    </w:p>
-                  </w:txbxContent>
-                </v:textbox>
-                <w10:wrap type="topAndBottom"/>
-              </v:shape>
-            </w:pict>
-          </mc:Fallback>
-        </mc:AlternateContent>
-      </w:r>
-      <w:r>
-        <w:rPr>
-          <w:noProof/>
-        </w:rPr>
-        <w:drawing>
-          <wp:anchor distT="0" distB="0" distL="114300" distR="114300" simplePos="0" relativeHeight="251669504" behindDoc="0" locked="0" layoutInCell="1" allowOverlap="1" wp14:anchorId="5418D3A5" wp14:editId="221E66E2">
-            <wp:simplePos x="0" y="0"/>
-            <wp:positionH relativeFrom="margin">
-              <wp:align>right</wp:align>
-            </wp:positionH>
-            <wp:positionV relativeFrom="paragraph">
-              <wp:posOffset>833169</wp:posOffset>
-            </wp:positionV>
-            <wp:extent cx="2468805" cy="1662546"/>
-            <wp:effectExtent l="266700" t="0" r="103505" b="185420"/>
-            <wp:wrapTopAndBottom/>
-            <wp:docPr id="19" name="Image 19"/>
-            <wp:cNvGraphicFramePr>
-              <a:graphicFrameLocks xmlns:a="http://schemas.openxmlformats.org/drawingml/2006/main" noChangeAspect="1"/>
-            </wp:cNvGraphicFramePr>
-            <a:graphic xmlns:a="http://schemas.openxmlformats.org/drawingml/2006/main">
-              <a:graphicData uri="http://schemas.openxmlformats.org/drawingml/2006/picture">
-                <pic:pic xmlns:pic="http://schemas.openxmlformats.org/drawingml/2006/picture">
-                  <pic:nvPicPr>
-                    <pic:cNvPr id="19" name="halfsphere.png"/>
-                    <pic:cNvPicPr/>
-                  </pic:nvPicPr>
-                  <pic:blipFill rotWithShape="1">
-                    <a:blip r:embed="rId32" cstate="print">
-                      <a:extLst>
-                        <a:ext uri="{28A0092B-C50C-407E-A947-70E740481C1C}">
-                          <a14:useLocalDpi xmlns:a14="http://schemas.microsoft.com/office/drawing/2010/main" val="0"/>
-                        </a:ext>
-                      </a:extLst>
-                    </a:blip>
-                    <a:srcRect t="15863" b="22432"/>
-                    <a:stretch/>
-                  </pic:blipFill>
-                  <pic:spPr bwMode="auto">
-                    <a:xfrm>
-                      <a:off x="0" y="0"/>
-                      <a:ext cx="2468805" cy="1662546"/>
-                    </a:xfrm>
-                    <a:prstGeom prst="rect">
-                      <a:avLst/>
-                    </a:prstGeom>
-                    <a:ln>
-                      <a:noFill/>
-                    </a:ln>
-                    <a:effectLst>
-                      <a:outerShdw blurRad="254000" dist="152400" dir="7920000" algn="tr" rotWithShape="0">
-                        <a:prstClr val="black">
-                          <a:alpha val="69000"/>
-                        </a:prstClr>
-                      </a:outerShdw>
-                    </a:effectLst>
-                    <a:extLst>
-                      <a:ext uri="{53640926-AAD7-44D8-BBD7-CCE9431645EC}">
-                        <a14:shadowObscured xmlns:a14="http://schemas.microsoft.com/office/drawing/2010/main"/>
-                      </a:ext>
-                    </a:extLst>
-                  </pic:spPr>
-                </pic:pic>
-              </a:graphicData>
-            </a:graphic>
-            <wp14:sizeRelH relativeFrom="margin">
-              <wp14:pctWidth>0</wp14:pctWidth>
-            </wp14:sizeRelH>
-            <wp14:sizeRelV relativeFrom="margin">
-              <wp14:pctHeight>0</wp14:pctHeight>
-            </wp14:sizeRelV>
-          </wp:anchor>
-        </w:drawing>
-      </w:r>
-      <w:r>
-        <w:rPr>
-          <w:noProof/>
-        </w:rPr>
-        <mc:AlternateContent>
-          <mc:Choice Requires="wps">
-            <w:drawing>
-              <wp:anchor distT="0" distB="0" distL="114300" distR="114300" simplePos="0" relativeHeight="251675648" behindDoc="0" locked="0" layoutInCell="1" allowOverlap="1" wp14:anchorId="231B1B0B" wp14:editId="1E5627F5">
-                <wp:simplePos x="0" y="0"/>
-                <wp:positionH relativeFrom="column">
-                  <wp:posOffset>0</wp:posOffset>
-                </wp:positionH>
-                <wp:positionV relativeFrom="paragraph">
-                  <wp:posOffset>2635250</wp:posOffset>
+                  <wp:posOffset>2600325</wp:posOffset>
                 </wp:positionV>
                 <wp:extent cx="2545715" cy="635"/>
                 <wp:effectExtent l="0" t="0" r="0" b="0"/>
@@ -3268,14 +3214,27 @@
                             <w:r>
                               <w:t xml:space="preserve">Figure </w:t>
                             </w:r>
-                            <w:fldSimple w:instr=" SEQ Figure \* ARABIC ">
-                              <w:r>
-                                <w:rPr>
-                                  <w:noProof/>
-                                </w:rPr>
-                                <w:t>5</w:t>
-                              </w:r>
-                            </w:fldSimple>
+                            <w:r>
+                              <w:fldChar w:fldCharType="begin"/>
+                            </w:r>
+                            <w:r>
+                              <w:instrText xml:space="preserve"> SEQ Figure \* ARABIC </w:instrText>
+                            </w:r>
+                            <w:r>
+                              <w:fldChar w:fldCharType="separate"/>
+                            </w:r>
+                            <w:r>
+                              <w:rPr>
+                                <w:noProof/>
+                              </w:rPr>
+                              <w:t>5</w:t>
+                            </w:r>
+                            <w:r>
+                              <w:rPr>
+                                <w:noProof/>
+                              </w:rPr>
+                              <w:fldChar w:fldCharType="end"/>
+                            </w:r>
                             <w:r>
                               <w:t xml:space="preserve"> : Angles de la caméra et vue du dessus, en 3D</w:t>
                             </w:r>
@@ -3296,7 +3255,7 @@
           </mc:Choice>
           <mc:Fallback>
             <w:pict>
-              <v:shape w14:anchorId="231B1B0B" id="Zone de texte 18" o:spid="_x0000_s1030" type="#_x0000_t202" style="position:absolute;margin-left:0;margin-top:207.5pt;width:200.45pt;height:.05pt;z-index:251675648;visibility:visible;mso-wrap-style:square;mso-wrap-distance-left:9pt;mso-wrap-distance-top:0;mso-wrap-distance-right:9pt;mso-wrap-distance-bottom:0;mso-position-horizontal:absolute;mso-position-horizontal-relative:text;mso-position-vertical:absolute;mso-position-vertical-relative:text;v-text-anchor:top" o:gfxdata="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" stroked="f">
+              <v:shape w14:anchorId="231B1B0B" id="Zone de texte 18" o:spid="_x0000_s1029" type="#_x0000_t202" style="position:absolute;margin-left:126.3pt;margin-top:204.75pt;width:200.45pt;height:.05pt;z-index:251675648;visibility:visible;mso-wrap-style:square;mso-wrap-distance-left:9pt;mso-wrap-distance-top:0;mso-wrap-distance-right:9pt;mso-wrap-distance-bottom:0;mso-position-horizontal:absolute;mso-position-horizontal-relative:text;mso-position-vertical:absolute;mso-position-vertical-relative:text;v-text-anchor:top" o:gfxdata="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" stroked="f">
                 <v:textbox style="mso-fit-shape-to-text:t" inset="0,0,0,0">
                   <w:txbxContent>
                     <w:p>
@@ -3309,14 +3268,27 @@
                       <w:r>
                         <w:t xml:space="preserve">Figure </w:t>
                       </w:r>
-                      <w:fldSimple w:instr=" SEQ Figure \* ARABIC ">
-                        <w:r>
-                          <w:rPr>
-                            <w:noProof/>
-                          </w:rPr>
-                          <w:t>5</w:t>
-                        </w:r>
-                      </w:fldSimple>
+                      <w:r>
+                        <w:fldChar w:fldCharType="begin"/>
+                      </w:r>
+                      <w:r>
+                        <w:instrText xml:space="preserve"> SEQ Figure \* ARABIC </w:instrText>
+                      </w:r>
+                      <w:r>
+                        <w:fldChar w:fldCharType="separate"/>
+                      </w:r>
+                      <w:r>
+                        <w:rPr>
+                          <w:noProof/>
+                        </w:rPr>
+                        <w:t>5</w:t>
+                      </w:r>
+                      <w:r>
+                        <w:rPr>
+                          <w:noProof/>
+                        </w:rPr>
+                        <w:fldChar w:fldCharType="end"/>
+                      </w:r>
                       <w:r>
                         <w:t xml:space="preserve"> : Angles de la caméra et vue du dessus, en 3D</w:t>
                       </w:r>
@@ -3334,13 +3306,13 @@
           <w:noProof/>
         </w:rPr>
         <w:drawing>
-          <wp:anchor distT="0" distB="0" distL="114300" distR="114300" simplePos="0" relativeHeight="251668480" behindDoc="0" locked="0" layoutInCell="1" allowOverlap="1" wp14:anchorId="3E22A779" wp14:editId="001528C4">
+          <wp:anchor distT="0" distB="0" distL="114300" distR="114300" simplePos="0" relativeHeight="251668480" behindDoc="0" locked="0" layoutInCell="1" allowOverlap="1" wp14:anchorId="3E22A779" wp14:editId="37F683C5">
             <wp:simplePos x="0" y="0"/>
             <wp:positionH relativeFrom="margin">
-              <wp:align>left</wp:align>
+              <wp:posOffset>1604514</wp:posOffset>
             </wp:positionH>
             <wp:positionV relativeFrom="paragraph">
-              <wp:posOffset>833433</wp:posOffset>
+              <wp:posOffset>798615</wp:posOffset>
             </wp:positionV>
             <wp:extent cx="2545715" cy="1744980"/>
             <wp:effectExtent l="0" t="0" r="6985" b="7620"/>
@@ -3357,7 +3329,7 @@
                     <pic:cNvPicPr/>
                   </pic:nvPicPr>
                   <pic:blipFill rotWithShape="1">
-                    <a:blip r:embed="rId33" cstate="print">
+                    <a:blip r:embed="rId32" cstate="print">
                       <a:extLst>
                         <a:ext uri="{28A0092B-C50C-407E-A947-70E740481C1C}">
                           <a14:useLocalDpi xmlns:a14="http://schemas.microsoft.com/office/drawing/2010/main" val="0"/>
@@ -3397,16 +3369,53 @@
         </w:drawing>
       </w:r>
       <w:r>
-        <w:t>Maintenant lorsque le joueur veut passer en vue orthographique, il clique sur « Q » et la caméra se place au-dessus du joueur et aplati les éléments visibles.</w:t>
+        <w:t>Lorsque</w:t>
+      </w:r>
+      <w:r>
+        <w:t xml:space="preserve"> le joueur veut passer en </w:t>
+      </w:r>
+      <w:r>
+        <w:rPr>
+          <w:b/>
+        </w:rPr>
+        <w:t>vue orthographique</w:t>
+      </w:r>
+      <w:r>
+        <w:t>, il clique sur « </w:t>
+      </w:r>
+      <w:r>
+        <w:rPr>
+          <w:b/>
+        </w:rPr>
+        <w:t>Q</w:t>
+      </w:r>
+      <w:r>
+        <w:t xml:space="preserve"> » et la caméra se place </w:t>
+      </w:r>
+      <w:r>
+        <w:rPr>
+          <w:b/>
+        </w:rPr>
+        <w:t>au-dessus du joueur</w:t>
+      </w:r>
+      <w:r>
+        <w:t xml:space="preserve"> et aplati les éléments visibles.</w:t>
       </w:r>
       <w:r>
         <w:t xml:space="preserve"> </w:t>
       </w:r>
       <w:r>
-        <w:t>Si on considère toutes les positions possibles, elles s’apparentent donc à une demi-sphère. Voici un schéma qui illustre toutes les positions de caméra possibles :</w:t>
-      </w:r>
-    </w:p>
-    <w:p/>
+        <w:t>Si on considère toutes les positions possibles</w:t>
+      </w:r>
+      <w:r>
+        <w:t xml:space="preserve"> de la caméra</w:t>
+      </w:r>
+      <w:r>
+        <w:t>, elles s’apparentent donc à une demi-sphère. Voici un schéma qui illustre toutes les positions de caméra possibles :</w:t>
+      </w:r>
+      <w:bookmarkStart w:id="17" w:name="_GoBack"/>
+      <w:bookmarkEnd w:id="17"/>
+    </w:p>
     <w:p/>
     <w:p>
       <w:pPr>
@@ -3416,13 +3425,13 @@
           <w:numId w:val="1"/>
         </w:numPr>
       </w:pPr>
-      <w:bookmarkStart w:id="19" w:name="_Toc193724392"/>
-      <w:bookmarkStart w:id="20" w:name="_Toc193788241"/>
+      <w:bookmarkStart w:id="18" w:name="_Toc193724392"/>
+      <w:bookmarkStart w:id="19" w:name="_Toc193788241"/>
       <w:r>
         <w:t>Résultats</w:t>
       </w:r>
+      <w:bookmarkEnd w:id="18"/>
       <w:bookmarkEnd w:id="19"/>
-      <w:bookmarkEnd w:id="20"/>
     </w:p>
     <w:p>
       <w:pPr>
@@ -3471,13 +3480,13 @@
           <w:numId w:val="1"/>
         </w:numPr>
       </w:pPr>
-      <w:bookmarkStart w:id="21" w:name="_Toc193724393"/>
-      <w:bookmarkStart w:id="22" w:name="_Toc193788242"/>
+      <w:bookmarkStart w:id="20" w:name="_Toc193724393"/>
+      <w:bookmarkStart w:id="21" w:name="_Toc193788242"/>
       <w:r>
         <w:t>Conclusion</w:t>
       </w:r>
+      <w:bookmarkEnd w:id="20"/>
       <w:bookmarkEnd w:id="21"/>
-      <w:bookmarkEnd w:id="22"/>
     </w:p>
     <w:p>
       <w:pPr>
@@ -3526,13 +3535,13 @@
           <w:numId w:val="1"/>
         </w:numPr>
       </w:pPr>
-      <w:bookmarkStart w:id="23" w:name="_Toc193724394"/>
-      <w:bookmarkStart w:id="24" w:name="_Toc193788243"/>
+      <w:bookmarkStart w:id="22" w:name="_Toc193724394"/>
+      <w:bookmarkStart w:id="23" w:name="_Toc193788243"/>
       <w:r>
         <w:t>Annexes</w:t>
       </w:r>
+      <w:bookmarkEnd w:id="22"/>
       <w:bookmarkEnd w:id="23"/>
-      <w:bookmarkEnd w:id="24"/>
     </w:p>
     <w:p>
       <w:pPr>
@@ -3574,8 +3583,8 @@
       </w:r>
     </w:p>
     <w:sectPr>
-      <w:headerReference w:type="default" r:id="rId34"/>
-      <w:footerReference w:type="default" r:id="rId35"/>
+      <w:headerReference w:type="default" r:id="rId33"/>
+      <w:footerReference w:type="default" r:id="rId34"/>
       <w:pgSz w:w="11906" w:h="16838"/>
       <w:pgMar w:top="1417" w:right="1417" w:bottom="1417" w:left="1417" w:header="708" w:footer="708" w:gutter="0"/>
       <w:pgNumType w:start="1"/>
@@ -5278,7 +5287,7 @@
 </file>
 
 <file path=customXml/itemProps1.xml><?xml version="1.0" encoding="utf-8"?>
-<ds:datastoreItem xmlns:ds="http://schemas.openxmlformats.org/officeDocument/2006/customXml" ds:itemID="{AB84B2C1-115A-4EA6-B9B5-6C69A11E24C1}">
+<ds:datastoreItem xmlns:ds="http://schemas.openxmlformats.org/officeDocument/2006/customXml" ds:itemID="{5C04446C-2452-43DB-9F89-E56A63A26D0E}">
   <ds:schemaRefs>
     <ds:schemaRef ds:uri="http://schemas.openxmlformats.org/officeDocument/2006/bibliography"/>
   </ds:schemaRefs>

</xml_diff>